<commit_message>
Update CMPS350_Project Phase 1_Report.docx
</commit_message>
<xml_diff>
--- a/CMPS350_Project Phase 1_Report.docx
+++ b/CMPS350_Project Phase 1_Report.docx
@@ -207,9 +207,8 @@
                 <w:sz w:val="24"/>
                 <w:szCs w:val="24"/>
               </w:rPr>
-              <w:t>Student1 full name (</w:t>
+              <w:t>Ali Adel Abouelkhir</w:t>
             </w:r>
-            <w:proofErr w:type="spellStart"/>
             <w:r>
               <w:rPr>
                 <w:bCs/>
@@ -217,9 +216,26 @@
                 <w:sz w:val="24"/>
                 <w:szCs w:val="24"/>
               </w:rPr>
-              <w:t>StudentId</w:t>
+              <w:t xml:space="preserve"> </w:t>
             </w:r>
-            <w:proofErr w:type="spellEnd"/>
+            <w:r>
+              <w:rPr>
+                <w:bCs/>
+                <w:color w:val="auto"/>
+                <w:sz w:val="24"/>
+                <w:szCs w:val="24"/>
+              </w:rPr>
+              <w:t>(</w:t>
+            </w:r>
+            <w:r>
+              <w:rPr>
+                <w:bCs/>
+                <w:color w:val="auto"/>
+                <w:sz w:val="24"/>
+                <w:szCs w:val="24"/>
+              </w:rPr>
+              <w:t>202206551</w:t>
+            </w:r>
             <w:r>
               <w:rPr>
                 <w:bCs/>
@@ -316,8 +332,8 @@
           </w:p>
           <w:p>
             <w:pPr>
-              <w:spacing w:after="0" w:line="240" w:lineRule="auto"/>
-              <w:ind w:left="0" w:firstLine="0"/>
+              <w:spacing w:after="0"/>
+              <w:ind w:left="0" w:right="249" w:firstLine="0"/>
               <w:jc w:val="left"/>
               <w:rPr>
                 <w:bCs/>
@@ -326,6 +342,24 @@
                 <w:szCs w:val="24"/>
               </w:rPr>
             </w:pPr>
+            <w:r>
+              <w:rPr>
+                <w:b/>
+                <w:color w:val="auto"/>
+                <w:sz w:val="24"/>
+                <w:szCs w:val="24"/>
+              </w:rPr>
+              <w:t>Emails:</w:t>
+            </w:r>
+            <w:r>
+              <w:rPr>
+                <w:bCs/>
+                <w:color w:val="auto"/>
+                <w:sz w:val="24"/>
+                <w:szCs w:val="24"/>
+              </w:rPr>
+              <w:t xml:space="preserve"> </w:t>
+            </w:r>
           </w:p>
           <w:p>
             <w:pPr>
@@ -333,6 +367,48 @@
               <w:ind w:left="0" w:right="249" w:firstLine="0"/>
               <w:jc w:val="left"/>
               <w:rPr>
+                <w:bCs/>
+                <w:color w:val="auto"/>
+                <w:sz w:val="24"/>
+                <w:szCs w:val="24"/>
+              </w:rPr>
+            </w:pPr>
+            <w:hyperlink r:id="rId11" w:history="1">
+              <w:r>
+                <w:rPr>
+                  <w:rStyle w:val="Hyperlink"/>
+                  <w:bCs/>
+                  <w:sz w:val="24"/>
+                  <w:szCs w:val="24"/>
+                </w:rPr>
+                <w:t>Aa2206551@qu.edu.qa</w:t>
+              </w:r>
+            </w:hyperlink>
+            <w:r>
+              <w:rPr>
+                <w:bCs/>
+                <w:color w:val="auto"/>
+                <w:sz w:val="24"/>
+                <w:szCs w:val="24"/>
+              </w:rPr>
+              <w:t xml:space="preserve"> </w:t>
+            </w:r>
+            <w:r>
+              <w:rPr>
+                <w:bCs/>
+                <w:color w:val="auto"/>
+                <w:sz w:val="24"/>
+                <w:szCs w:val="24"/>
+              </w:rPr>
+              <w:t>;</w:t>
+            </w:r>
+          </w:p>
+          <w:p>
+            <w:pPr>
+              <w:spacing w:after="0"/>
+              <w:ind w:left="0" w:right="249" w:firstLine="0"/>
+              <w:jc w:val="left"/>
+              <w:rPr>
                 <w:b/>
                 <w:bCs/>
                 <w:sz w:val="28"/>
@@ -341,21 +417,12 @@
             </w:pPr>
             <w:r>
               <w:rPr>
-                <w:b/>
-                <w:color w:val="auto"/>
-                <w:sz w:val="24"/>
-                <w:szCs w:val="24"/>
-              </w:rPr>
-              <w:t>Emails:</w:t>
-            </w:r>
-            <w:r>
-              <w:rPr>
                 <w:bCs/>
                 <w:color w:val="auto"/>
                 <w:sz w:val="24"/>
                 <w:szCs w:val="24"/>
               </w:rPr>
-              <w:t xml:space="preserve"> student1@student.qu.edu.qa; student2@student.qu.edu.qa; student3@student.qu.edu.qa;</w:t>
+              <w:t xml:space="preserve"> student2@student.qu.edu.qa; student3@student.qu.edu.qa;</w:t>
             </w:r>
           </w:p>
         </w:tc>
@@ -2548,7 +2615,7 @@
                     <pic:cNvPicPr/>
                   </pic:nvPicPr>
                   <pic:blipFill>
-                    <a:blip r:embed="rId11"/>
+                    <a:blip r:embed="rId12"/>
                     <a:stretch>
                       <a:fillRect/>
                     </a:stretch>
@@ -2679,6 +2746,357 @@
       </w:pPr>
       <w:r>
         <w:t>Use case 1</w:t>
+      </w:r>
+      <w:r>
+        <w:t xml:space="preserve">: </w:t>
+      </w:r>
+    </w:p>
+    <w:p>
+      <w:pPr>
+        <w:ind w:left="730"/>
+        <w:rPr>
+          <w:noProof/>
+        </w:rPr>
+      </w:pPr>
+      <w:r>
+        <w:drawing>
+          <wp:inline distT="0" distB="0" distL="0" distR="0" wp14:anchorId="1536E306" wp14:editId="3F081D9A">
+            <wp:extent cx="3030279" cy="2652045"/>
+            <wp:effectExtent l="0" t="0" r="0" b="0"/>
+            <wp:docPr id="104952766" name="Picture 1"/>
+            <wp:cNvGraphicFramePr>
+              <a:graphicFrameLocks xmlns:a="http://schemas.openxmlformats.org/drawingml/2006/main" noChangeAspect="1"/>
+            </wp:cNvGraphicFramePr>
+            <a:graphic xmlns:a="http://schemas.openxmlformats.org/drawingml/2006/main">
+              <a:graphicData uri="http://schemas.openxmlformats.org/drawingml/2006/picture">
+                <pic:pic xmlns:pic="http://schemas.openxmlformats.org/drawingml/2006/picture">
+                  <pic:nvPicPr>
+                    <pic:cNvPr id="104952766" name=""/>
+                    <pic:cNvPicPr/>
+                  </pic:nvPicPr>
+                  <pic:blipFill>
+                    <a:blip r:embed="rId13"/>
+                    <a:stretch>
+                      <a:fillRect/>
+                    </a:stretch>
+                  </pic:blipFill>
+                  <pic:spPr>
+                    <a:xfrm>
+                      <a:off x="0" y="0"/>
+                      <a:ext cx="3047931" cy="2667494"/>
+                    </a:xfrm>
+                    <a:prstGeom prst="rect">
+                      <a:avLst/>
+                    </a:prstGeom>
+                  </pic:spPr>
+                </pic:pic>
+              </a:graphicData>
+            </a:graphic>
+          </wp:inline>
+        </w:drawing>
+      </w:r>
+      <w:r>
+        <w:rPr>
+          <w:noProof/>
+        </w:rPr>
+        <w:t xml:space="preserve"> </w:t>
+      </w:r>
+      <w:r>
+        <w:drawing>
+          <wp:inline distT="0" distB="0" distL="0" distR="0" wp14:anchorId="4E93267B" wp14:editId="4A994C94">
+            <wp:extent cx="2426876" cy="2700655"/>
+            <wp:effectExtent l="0" t="0" r="0" b="4445"/>
+            <wp:docPr id="194508534" name="Picture 1" descr="A screenshot of a login page&#10;&#10;AI-generated content may be incorrect."/>
+            <wp:cNvGraphicFramePr>
+              <a:graphicFrameLocks xmlns:a="http://schemas.openxmlformats.org/drawingml/2006/main" noChangeAspect="1"/>
+            </wp:cNvGraphicFramePr>
+            <a:graphic xmlns:a="http://schemas.openxmlformats.org/drawingml/2006/main">
+              <a:graphicData uri="http://schemas.openxmlformats.org/drawingml/2006/picture">
+                <pic:pic xmlns:pic="http://schemas.openxmlformats.org/drawingml/2006/picture">
+                  <pic:nvPicPr>
+                    <pic:cNvPr id="194508534" name="Picture 1" descr="A screenshot of a login page&#10;&#10;AI-generated content may be incorrect."/>
+                    <pic:cNvPicPr/>
+                  </pic:nvPicPr>
+                  <pic:blipFill>
+                    <a:blip r:embed="rId14"/>
+                    <a:stretch>
+                      <a:fillRect/>
+                    </a:stretch>
+                  </pic:blipFill>
+                  <pic:spPr>
+                    <a:xfrm>
+                      <a:off x="0" y="0"/>
+                      <a:ext cx="2455491" cy="2732499"/>
+                    </a:xfrm>
+                    <a:prstGeom prst="rect">
+                      <a:avLst/>
+                    </a:prstGeom>
+                  </pic:spPr>
+                </pic:pic>
+              </a:graphicData>
+            </a:graphic>
+          </wp:inline>
+        </w:drawing>
+      </w:r>
+      <w:r>
+        <w:rPr>
+          <w:noProof/>
+        </w:rPr>
+        <w:t xml:space="preserve"> </w:t>
+      </w:r>
+      <w:r>
+        <w:rPr>
+          <w:noProof/>
+        </w:rPr>
+        <w:drawing>
+          <wp:inline distT="0" distB="0" distL="0" distR="0" wp14:anchorId="4504B55D" wp14:editId="296AF2B4">
+            <wp:extent cx="3021594" cy="2164715"/>
+            <wp:effectExtent l="0" t="0" r="7620" b="6985"/>
+            <wp:docPr id="1962707371" name="Picture 1" descr="A screenshot of a computer&#10;&#10;AI-generated content may be incorrect."/>
+            <wp:cNvGraphicFramePr>
+              <a:graphicFrameLocks xmlns:a="http://schemas.openxmlformats.org/drawingml/2006/main" noChangeAspect="1"/>
+            </wp:cNvGraphicFramePr>
+            <a:graphic xmlns:a="http://schemas.openxmlformats.org/drawingml/2006/main">
+              <a:graphicData uri="http://schemas.openxmlformats.org/drawingml/2006/picture">
+                <pic:pic xmlns:pic="http://schemas.openxmlformats.org/drawingml/2006/picture">
+                  <pic:nvPicPr>
+                    <pic:cNvPr id="1962707371" name="Picture 1" descr="A screenshot of a computer&#10;&#10;AI-generated content may be incorrect."/>
+                    <pic:cNvPicPr/>
+                  </pic:nvPicPr>
+                  <pic:blipFill>
+                    <a:blip r:embed="rId15"/>
+                    <a:stretch>
+                      <a:fillRect/>
+                    </a:stretch>
+                  </pic:blipFill>
+                  <pic:spPr>
+                    <a:xfrm>
+                      <a:off x="0" y="0"/>
+                      <a:ext cx="3032548" cy="2172563"/>
+                    </a:xfrm>
+                    <a:prstGeom prst="rect">
+                      <a:avLst/>
+                    </a:prstGeom>
+                  </pic:spPr>
+                </pic:pic>
+              </a:graphicData>
+            </a:graphic>
+          </wp:inline>
+        </w:drawing>
+      </w:r>
+      <w:r>
+        <w:rPr>
+          <w:noProof/>
+        </w:rPr>
+        <w:t xml:space="preserve"> </w:t>
+      </w:r>
+      <w:r>
+        <w:rPr>
+          <w:noProof/>
+        </w:rPr>
+        <w:drawing>
+          <wp:inline distT="0" distB="0" distL="0" distR="0" wp14:anchorId="2229AD66" wp14:editId="084FCD41">
+            <wp:extent cx="3062377" cy="2121232"/>
+            <wp:effectExtent l="0" t="0" r="5080" b="0"/>
+            <wp:docPr id="981505540" name="Picture 1" descr="A screenshot of a computer&#10;&#10;AI-generated content may be incorrect."/>
+            <wp:cNvGraphicFramePr>
+              <a:graphicFrameLocks xmlns:a="http://schemas.openxmlformats.org/drawingml/2006/main" noChangeAspect="1"/>
+            </wp:cNvGraphicFramePr>
+            <a:graphic xmlns:a="http://schemas.openxmlformats.org/drawingml/2006/main">
+              <a:graphicData uri="http://schemas.openxmlformats.org/drawingml/2006/picture">
+                <pic:pic xmlns:pic="http://schemas.openxmlformats.org/drawingml/2006/picture">
+                  <pic:nvPicPr>
+                    <pic:cNvPr id="981505540" name="Picture 1" descr="A screenshot of a computer&#10;&#10;AI-generated content may be incorrect."/>
+                    <pic:cNvPicPr/>
+                  </pic:nvPicPr>
+                  <pic:blipFill>
+                    <a:blip r:embed="rId16"/>
+                    <a:stretch>
+                      <a:fillRect/>
+                    </a:stretch>
+                  </pic:blipFill>
+                  <pic:spPr>
+                    <a:xfrm>
+                      <a:off x="0" y="0"/>
+                      <a:ext cx="3091311" cy="2141274"/>
+                    </a:xfrm>
+                    <a:prstGeom prst="rect">
+                      <a:avLst/>
+                    </a:prstGeom>
+                  </pic:spPr>
+                </pic:pic>
+              </a:graphicData>
+            </a:graphic>
+          </wp:inline>
+        </w:drawing>
+      </w:r>
+    </w:p>
+    <w:p>
+      <w:pPr>
+        <w:ind w:left="730"/>
+      </w:pPr>
+      <w:r>
+        <w:drawing>
+          <wp:inline distT="0" distB="0" distL="0" distR="0" wp14:anchorId="26BCA7B5" wp14:editId="6CA27212">
+            <wp:extent cx="3048000" cy="2050723"/>
+            <wp:effectExtent l="0" t="0" r="0" b="6985"/>
+            <wp:docPr id="321393092" name="Picture 1"/>
+            <wp:cNvGraphicFramePr>
+              <a:graphicFrameLocks xmlns:a="http://schemas.openxmlformats.org/drawingml/2006/main" noChangeAspect="1"/>
+            </wp:cNvGraphicFramePr>
+            <a:graphic xmlns:a="http://schemas.openxmlformats.org/drawingml/2006/main">
+              <a:graphicData uri="http://schemas.openxmlformats.org/drawingml/2006/picture">
+                <pic:pic xmlns:pic="http://schemas.openxmlformats.org/drawingml/2006/picture">
+                  <pic:nvPicPr>
+                    <pic:cNvPr id="321393092" name=""/>
+                    <pic:cNvPicPr/>
+                  </pic:nvPicPr>
+                  <pic:blipFill>
+                    <a:blip r:embed="rId17"/>
+                    <a:stretch>
+                      <a:fillRect/>
+                    </a:stretch>
+                  </pic:blipFill>
+                  <pic:spPr>
+                    <a:xfrm>
+                      <a:off x="0" y="0"/>
+                      <a:ext cx="3055751" cy="2055938"/>
+                    </a:xfrm>
+                    <a:prstGeom prst="rect">
+                      <a:avLst/>
+                    </a:prstGeom>
+                  </pic:spPr>
+                </pic:pic>
+              </a:graphicData>
+            </a:graphic>
+          </wp:inline>
+        </w:drawing>
+      </w:r>
+      <w:r>
+        <w:rPr>
+          <w:noProof/>
+        </w:rPr>
+        <w:t xml:space="preserve"> </w:t>
+      </w:r>
+      <w:r>
+        <w:drawing>
+          <wp:inline distT="0" distB="0" distL="0" distR="0" wp14:anchorId="698918DA" wp14:editId="5E512E75">
+            <wp:extent cx="2971800" cy="2060575"/>
+            <wp:effectExtent l="0" t="0" r="0" b="0"/>
+            <wp:docPr id="2053155662" name="Picture 1" descr="A screenshot of a computer&#10;&#10;AI-generated content may be incorrect."/>
+            <wp:cNvGraphicFramePr>
+              <a:graphicFrameLocks xmlns:a="http://schemas.openxmlformats.org/drawingml/2006/main" noChangeAspect="1"/>
+            </wp:cNvGraphicFramePr>
+            <a:graphic xmlns:a="http://schemas.openxmlformats.org/drawingml/2006/main">
+              <a:graphicData uri="http://schemas.openxmlformats.org/drawingml/2006/picture">
+                <pic:pic xmlns:pic="http://schemas.openxmlformats.org/drawingml/2006/picture">
+                  <pic:nvPicPr>
+                    <pic:cNvPr id="2053155662" name="Picture 1" descr="A screenshot of a computer&#10;&#10;AI-generated content may be incorrect."/>
+                    <pic:cNvPicPr/>
+                  </pic:nvPicPr>
+                  <pic:blipFill>
+                    <a:blip r:embed="rId18"/>
+                    <a:stretch>
+                      <a:fillRect/>
+                    </a:stretch>
+                  </pic:blipFill>
+                  <pic:spPr>
+                    <a:xfrm>
+                      <a:off x="0" y="0"/>
+                      <a:ext cx="2992726" cy="2075085"/>
+                    </a:xfrm>
+                    <a:prstGeom prst="rect">
+                      <a:avLst/>
+                    </a:prstGeom>
+                  </pic:spPr>
+                </pic:pic>
+              </a:graphicData>
+            </a:graphic>
+          </wp:inline>
+        </w:drawing>
+      </w:r>
+      <w:r>
+        <w:drawing>
+          <wp:inline distT="0" distB="0" distL="0" distR="0" wp14:anchorId="00EF9CE5" wp14:editId="146E8C44">
+            <wp:extent cx="3009900" cy="1819016"/>
+            <wp:effectExtent l="0" t="0" r="0" b="0"/>
+            <wp:docPr id="791546976" name="Picture 1" descr="A screenshot of a computer screen&#10;&#10;AI-generated content may be incorrect."/>
+            <wp:cNvGraphicFramePr>
+              <a:graphicFrameLocks xmlns:a="http://schemas.openxmlformats.org/drawingml/2006/main" noChangeAspect="1"/>
+            </wp:cNvGraphicFramePr>
+            <a:graphic xmlns:a="http://schemas.openxmlformats.org/drawingml/2006/main">
+              <a:graphicData uri="http://schemas.openxmlformats.org/drawingml/2006/picture">
+                <pic:pic xmlns:pic="http://schemas.openxmlformats.org/drawingml/2006/picture">
+                  <pic:nvPicPr>
+                    <pic:cNvPr id="791546976" name="Picture 1" descr="A screenshot of a computer screen&#10;&#10;AI-generated content may be incorrect."/>
+                    <pic:cNvPicPr/>
+                  </pic:nvPicPr>
+                  <pic:blipFill>
+                    <a:blip r:embed="rId19"/>
+                    <a:stretch>
+                      <a:fillRect/>
+                    </a:stretch>
+                  </pic:blipFill>
+                  <pic:spPr>
+                    <a:xfrm>
+                      <a:off x="0" y="0"/>
+                      <a:ext cx="3037274" cy="1835559"/>
+                    </a:xfrm>
+                    <a:prstGeom prst="rect">
+                      <a:avLst/>
+                    </a:prstGeom>
+                  </pic:spPr>
+                </pic:pic>
+              </a:graphicData>
+            </a:graphic>
+          </wp:inline>
+        </w:drawing>
+      </w:r>
+      <w:r>
+        <w:rPr>
+          <w:noProof/>
+        </w:rPr>
+        <w:t xml:space="preserve"> </w:t>
+      </w:r>
+      <w:r>
+        <w:rPr>
+          <w:noProof/>
+        </w:rPr>
+        <w:drawing>
+          <wp:inline distT="0" distB="0" distL="0" distR="0" wp14:anchorId="75C225B7" wp14:editId="3361352C">
+            <wp:extent cx="3041650" cy="1874520"/>
+            <wp:effectExtent l="0" t="0" r="6350" b="0"/>
+            <wp:docPr id="1461672796" name="Picture 1" descr="A screenshot of a computer&#10;&#10;AI-generated content may be incorrect."/>
+            <wp:cNvGraphicFramePr>
+              <a:graphicFrameLocks xmlns:a="http://schemas.openxmlformats.org/drawingml/2006/main" noChangeAspect="1"/>
+            </wp:cNvGraphicFramePr>
+            <a:graphic xmlns:a="http://schemas.openxmlformats.org/drawingml/2006/main">
+              <a:graphicData uri="http://schemas.openxmlformats.org/drawingml/2006/picture">
+                <pic:pic xmlns:pic="http://schemas.openxmlformats.org/drawingml/2006/picture">
+                  <pic:nvPicPr>
+                    <pic:cNvPr id="1461672796" name="Picture 1" descr="A screenshot of a computer&#10;&#10;AI-generated content may be incorrect."/>
+                    <pic:cNvPicPr/>
+                  </pic:nvPicPr>
+                  <pic:blipFill>
+                    <a:blip r:embed="rId20"/>
+                    <a:stretch>
+                      <a:fillRect/>
+                    </a:stretch>
+                  </pic:blipFill>
+                  <pic:spPr>
+                    <a:xfrm>
+                      <a:off x="0" y="0"/>
+                      <a:ext cx="3087202" cy="1902593"/>
+                    </a:xfrm>
+                    <a:prstGeom prst="rect">
+                      <a:avLst/>
+                    </a:prstGeom>
+                  </pic:spPr>
+                </pic:pic>
+              </a:graphicData>
+            </a:graphic>
+          </wp:inline>
+        </w:drawing>
       </w:r>
     </w:p>
     <w:p>
@@ -2919,9 +3337,9 @@
     </w:tbl>
     <w:p/>
     <w:sectPr>
-      <w:footerReference w:type="even" r:id="rId12"/>
-      <w:footerReference w:type="default" r:id="rId13"/>
-      <w:footerReference w:type="first" r:id="rId14"/>
+      <w:footerReference w:type="even" r:id="rId21"/>
+      <w:footerReference w:type="default" r:id="rId22"/>
+      <w:footerReference w:type="first" r:id="rId23"/>
       <w:pgSz w:w="12240" w:h="15840"/>
       <w:pgMar w:top="720" w:right="720" w:bottom="720" w:left="720" w:header="720" w:footer="719" w:gutter="0"/>
       <w:cols w:space="720"/>
@@ -3140,7 +3558,7 @@
     <mc:AlternateContent>
       <mc:Choice Requires="v">
         <w:pict>
-          <v:shapetype w14:anchorId="25E3C6F1" id="_x0000_t75" coordsize="21600,21600" o:spt="75" o:preferrelative="t" path="m@4@5l@4@11@9@11@9@5xe" filled="f" stroked="f">
+          <v:shapetype w14:anchorId="40BE9D69" id="_x0000_t75" coordsize="21600,21600" o:spt="75" o:preferrelative="t" path="m@4@5l@4@11@9@11@9@5xe" filled="f" stroked="f">
             <v:stroke joinstyle="miter"/>
             <v:formulas>
               <v:f eqn="if lineDrawn pixelLineWidth 0"/>
@@ -3159,17 +3577,17 @@
             <v:path o:extrusionok="f" gradientshapeok="t" o:connecttype="rect"/>
             <o:lock v:ext="edit" aspectratio="t"/>
           </v:shapetype>
-          <v:shape id="Picture 1866173464" o:spid="_x0000_i1025" type="#_x0000_t75" style="width:14pt;height:14pt;visibility:visible;mso-wrap-style:square">
+          <v:shape id="Picture 515805728" o:spid="_x0000_i1025" type="#_x0000_t75" style="width:14pt;height:14pt;visibility:visible;mso-wrap-style:square">
             <v:imagedata r:id="rId1" o:title=""/>
           </v:shape>
         </w:pict>
       </mc:Choice>
       <mc:Fallback>
         <w:drawing>
-          <wp:inline distT="0" distB="0" distL="0" distR="0" wp14:anchorId="21F960AF" wp14:editId="76FEDD75">
+          <wp:inline distT="0" distB="0" distL="0" distR="0" wp14:anchorId="32D38A4D" wp14:editId="786D8429">
             <wp:extent cx="177800" cy="177800"/>
             <wp:effectExtent l="0" t="0" r="0" b="0"/>
-            <wp:docPr id="1866173464" name="Picture 1866173464"/>
+            <wp:docPr id="515805728" name="Picture 515805728"/>
             <wp:cNvGraphicFramePr>
               <a:graphicFrameLocks xmlns:a="http://schemas.openxmlformats.org/drawingml/2006/main" noChangeAspect="1"/>
             </wp:cNvGraphicFramePr>
@@ -8617,6 +9035,18 @@
       <w:szCs w:val="24"/>
     </w:rPr>
   </w:style>
+  <w:style w:type="character" w:styleId="UnresolvedMention">
+    <w:name w:val="Unresolved Mention"/>
+    <w:basedOn w:val="DefaultParagraphFont"/>
+    <w:uiPriority w:val="99"/>
+    <w:semiHidden/>
+    <w:unhideWhenUsed/>
+    <w:rsid w:val="00DA2256"/>
+    <w:rPr>
+      <w:color w:val="605E5C"/>
+      <w:shd w:val="clear" w:color="auto" w:fill="E1DFDD"/>
+    </w:rPr>
+  </w:style>
 </w:styles>
 </file>
 
@@ -8882,15 +9312,6 @@
 </file>
 
 <file path=customXml/item1.xml><?xml version="1.0" encoding="utf-8"?>
-<?mso-contentType ?>
-<FormTemplates xmlns="http://schemas.microsoft.com/sharepoint/v3/contenttype/forms">
-  <Display>DocumentLibraryForm</Display>
-  <Edit>DocumentLibraryForm</Edit>
-  <New>DocumentLibraryForm</New>
-</FormTemplates>
-</file>
-
-<file path=customXml/item2.xml><?xml version="1.0" encoding="utf-8"?>
 <ct:contentTypeSchema xmlns:ct="http://schemas.microsoft.com/office/2006/metadata/contentType" xmlns:ma="http://schemas.microsoft.com/office/2006/metadata/properties/metaAttributes" ct:_="" ma:_="" ma:contentTypeName="Document" ma:contentTypeID="0x01010085BEF43317B4F840AC0C37E0D977D82E" ma:contentTypeVersion="12" ma:contentTypeDescription="Create a new document." ma:contentTypeScope="" ma:versionID="a2338617cbfbb51b2c0d33e4cb8684b1">
   <xsd:schema xmlns:xsd="http://www.w3.org/2001/XMLSchema" xmlns:xs="http://www.w3.org/2001/XMLSchema" xmlns:p="http://schemas.microsoft.com/office/2006/metadata/properties" xmlns:ns2="ff4433bc-22a3-4dac-805f-c635aff40461" xmlns:ns3="692651b8-6577-4651-a352-3b631599c082" targetNamespace="http://schemas.microsoft.com/office/2006/metadata/properties" ma:root="true" ma:fieldsID="0f93a4889667a75834aa97db9b978e47" ns2:_="" ns3:_="">
     <xsd:import namespace="ff4433bc-22a3-4dac-805f-c635aff40461"/>
@@ -9091,7 +9512,20 @@
 </ct:contentTypeSchema>
 </file>
 
+<file path=customXml/item2.xml><?xml version="1.0" encoding="utf-8"?>
+<?mso-contentType ?>
+<FormTemplates xmlns="http://schemas.microsoft.com/sharepoint/v3/contenttype/forms">
+  <Display>DocumentLibraryForm</Display>
+  <Edit>DocumentLibraryForm</Edit>
+  <New>DocumentLibraryForm</New>
+</FormTemplates>
+</file>
+
 <file path=customXml/item3.xml><?xml version="1.0" encoding="utf-8"?>
+<b:Sources xmlns:b="http://schemas.openxmlformats.org/officeDocument/2006/bibliography" xmlns="http://schemas.openxmlformats.org/officeDocument/2006/bibliography" SelectedStyle="\APASixthEditionOfficeOnline.xsl" StyleName="APA" Version="6"/>
+</file>
+
+<file path=customXml/item4.xml><?xml version="1.0" encoding="utf-8"?>
 <p:properties xmlns:p="http://schemas.microsoft.com/office/2006/metadata/properties" xmlns:xsi="http://www.w3.org/2001/XMLSchema-instance" xmlns:pc="http://schemas.microsoft.com/office/infopath/2007/PartnerControls">
   <documentManagement>
     <TaxCatchAll xmlns="692651b8-6577-4651-a352-3b631599c082" xsi:nil="true"/>
@@ -9102,19 +9536,7 @@
 </p:properties>
 </file>
 
-<file path=customXml/item4.xml><?xml version="1.0" encoding="utf-8"?>
-<b:Sources xmlns:b="http://schemas.openxmlformats.org/officeDocument/2006/bibliography" xmlns="http://schemas.openxmlformats.org/officeDocument/2006/bibliography" SelectedStyle="\APASixthEditionOfficeOnline.xsl" StyleName="APA" Version="6"/>
-</file>
-
 <file path=customXml/itemProps1.xml><?xml version="1.0" encoding="utf-8"?>
-<ds:datastoreItem xmlns:ds="http://schemas.openxmlformats.org/officeDocument/2006/customXml" ds:itemID="{899977B6-4170-4EBB-8EC3-1772808F953C}">
-  <ds:schemaRefs>
-    <ds:schemaRef ds:uri="http://schemas.microsoft.com/sharepoint/v3/contenttype/forms"/>
-  </ds:schemaRefs>
-</ds:datastoreItem>
-</file>
-
-<file path=customXml/itemProps2.xml><?xml version="1.0" encoding="utf-8"?>
 <ds:datastoreItem xmlns:ds="http://schemas.openxmlformats.org/officeDocument/2006/customXml" ds:itemID="{336297D6-A3E4-40E3-8F58-11EE5F3018B5}">
   <ds:schemaRefs>
     <ds:schemaRef ds:uri="http://schemas.microsoft.com/office/2006/metadata/contentType"/>
@@ -9133,7 +9555,23 @@
 </ds:datastoreItem>
 </file>
 
+<file path=customXml/itemProps2.xml><?xml version="1.0" encoding="utf-8"?>
+<ds:datastoreItem xmlns:ds="http://schemas.openxmlformats.org/officeDocument/2006/customXml" ds:itemID="{899977B6-4170-4EBB-8EC3-1772808F953C}">
+  <ds:schemaRefs>
+    <ds:schemaRef ds:uri="http://schemas.microsoft.com/sharepoint/v3/contenttype/forms"/>
+  </ds:schemaRefs>
+</ds:datastoreItem>
+</file>
+
 <file path=customXml/itemProps3.xml><?xml version="1.0" encoding="utf-8"?>
+<ds:datastoreItem xmlns:ds="http://schemas.openxmlformats.org/officeDocument/2006/customXml" ds:itemID="{EC954A2E-28E0-4668-92E6-EA1FC2D35EDB}">
+  <ds:schemaRefs>
+    <ds:schemaRef ds:uri="http://schemas.openxmlformats.org/officeDocument/2006/bibliography"/>
+  </ds:schemaRefs>
+</ds:datastoreItem>
+</file>
+
+<file path=customXml/itemProps4.xml><?xml version="1.0" encoding="utf-8"?>
 <ds:datastoreItem xmlns:ds="http://schemas.openxmlformats.org/officeDocument/2006/customXml" ds:itemID="{E9D8FE69-F782-45F1-BD7D-38E143528BC3}">
   <ds:schemaRefs>
     <ds:schemaRef ds:uri="http://schemas.microsoft.com/office/2006/metadata/properties"/>
@@ -9142,12 +9580,4 @@
     <ds:schemaRef ds:uri="ff4433bc-22a3-4dac-805f-c635aff40461"/>
   </ds:schemaRefs>
 </ds:datastoreItem>
-</file>
-
-<file path=customXml/itemProps4.xml><?xml version="1.0" encoding="utf-8"?>
-<ds:datastoreItem xmlns:ds="http://schemas.openxmlformats.org/officeDocument/2006/customXml" ds:itemID="{EC954A2E-28E0-4668-92E6-EA1FC2D35EDB}">
-  <ds:schemaRefs>
-    <ds:schemaRef ds:uri="http://schemas.openxmlformats.org/officeDocument/2006/bibliography"/>
-  </ds:schemaRefs>
-</ds:datastoreItem>
 </file>
</xml_diff>

<commit_message>
Add description and diagrams
</commit_message>
<xml_diff>
--- a/CMPS350_Project Phase 1_Report.docx
+++ b/CMPS350_Project Phase 1_Report.docx
@@ -207,16 +207,7 @@
                 <w:sz w:val="24"/>
                 <w:szCs w:val="24"/>
               </w:rPr>
-              <w:t>Ali Adel Abouelkhir</w:t>
-            </w:r>
-            <w:r>
-              <w:rPr>
-                <w:bCs/>
-                <w:color w:val="auto"/>
-                <w:sz w:val="24"/>
-                <w:szCs w:val="24"/>
-              </w:rPr>
-              <w:t xml:space="preserve"> </w:t>
+              <w:t xml:space="preserve">Ali Adel Abouelkhir </w:t>
             </w:r>
             <w:r>
               <w:rPr>
@@ -265,27 +256,7 @@
                 <w:sz w:val="24"/>
                 <w:szCs w:val="24"/>
               </w:rPr>
-              <w:t>Student2 full name (</w:t>
-            </w:r>
-            <w:proofErr w:type="spellStart"/>
-            <w:r>
-              <w:rPr>
-                <w:bCs/>
-                <w:color w:val="auto"/>
-                <w:sz w:val="24"/>
-                <w:szCs w:val="24"/>
-              </w:rPr>
-              <w:t>StudentId</w:t>
-            </w:r>
-            <w:proofErr w:type="spellEnd"/>
-            <w:r>
-              <w:rPr>
-                <w:bCs/>
-                <w:color w:val="auto"/>
-                <w:sz w:val="24"/>
-                <w:szCs w:val="24"/>
-              </w:rPr>
-              <w:t>)</w:t>
+              <w:t>Student2 full name (StudentId)</w:t>
             </w:r>
           </w:p>
           <w:p>
@@ -307,27 +278,7 @@
                 <w:sz w:val="24"/>
                 <w:szCs w:val="24"/>
               </w:rPr>
-              <w:t>Student3 full name (</w:t>
-            </w:r>
-            <w:proofErr w:type="spellStart"/>
-            <w:r>
-              <w:rPr>
-                <w:bCs/>
-                <w:color w:val="auto"/>
-                <w:sz w:val="24"/>
-                <w:szCs w:val="24"/>
-              </w:rPr>
-              <w:t>StudentId</w:t>
-            </w:r>
-            <w:proofErr w:type="spellEnd"/>
-            <w:r>
-              <w:rPr>
-                <w:bCs/>
-                <w:color w:val="auto"/>
-                <w:sz w:val="24"/>
-                <w:szCs w:val="24"/>
-              </w:rPr>
-              <w:t>)</w:t>
+              <w:t>Student3 full name (StudentId)</w:t>
             </w:r>
           </w:p>
           <w:p>
@@ -476,23 +427,7 @@
                 <w:sz w:val="28"/>
                 <w:szCs w:val="28"/>
               </w:rPr>
-              <w:t xml:space="preserve">Give a public link to </w:t>
-            </w:r>
-            <w:proofErr w:type="gramStart"/>
-            <w:r>
-              <w:rPr>
-                <w:sz w:val="28"/>
-                <w:szCs w:val="28"/>
-              </w:rPr>
-              <w:t>you</w:t>
-            </w:r>
-            <w:proofErr w:type="gramEnd"/>
-            <w:r>
-              <w:rPr>
-                <w:sz w:val="28"/>
-                <w:szCs w:val="28"/>
-              </w:rPr>
-              <w:t xml:space="preserve"> code </w:t>
+              <w:t xml:space="preserve">Give a public link to you code </w:t>
             </w:r>
             <w:r>
               <w:rPr>
@@ -530,7 +465,6 @@
           <w:szCs w:val="44"/>
         </w:rPr>
       </w:pPr>
-      <w:proofErr w:type="gramStart"/>
       <w:r>
         <w:rPr>
           <w:b/>
@@ -551,7 +485,6 @@
         </w:rPr>
         <w:t>:</w:t>
       </w:r>
-      <w:proofErr w:type="gramEnd"/>
     </w:p>
     <w:p>
       <w:pPr>
@@ -615,7 +548,6 @@
         </w:rPr>
         <w:t xml:space="preserve"> or </w:t>
       </w:r>
-      <w:proofErr w:type="gramStart"/>
       <w:r>
         <w:rPr>
           <w:b/>
@@ -625,19 +557,7 @@
           <w:szCs w:val="21"/>
           <w:highlight w:val="yellow"/>
         </w:rPr>
-        <w:t>Not</w:t>
-      </w:r>
-      <w:proofErr w:type="gramEnd"/>
-      <w:r>
-        <w:rPr>
-          <w:b/>
-          <w:i/>
-          <w:iCs/>
-          <w:sz w:val="21"/>
-          <w:szCs w:val="21"/>
-          <w:highlight w:val="yellow"/>
-        </w:rPr>
-        <w:t xml:space="preserve"> done</w:t>
+        <w:t>Not done</w:t>
       </w:r>
       <w:r>
         <w:rPr>
@@ -1277,7 +1197,6 @@
                 <w:szCs w:val="20"/>
               </w:rPr>
             </w:pPr>
-            <w:proofErr w:type="gramStart"/>
             <w:r>
               <w:rPr>
                 <w:rFonts w:ascii="Times New Roman" w:hAnsi="Times New Roman" w:cs="Times New Roman"/>
@@ -1285,17 +1204,7 @@
                 <w:sz w:val="20"/>
                 <w:szCs w:val="20"/>
               </w:rPr>
-              <w:t>Team work</w:t>
-            </w:r>
-            <w:proofErr w:type="gramEnd"/>
-            <w:r>
-              <w:rPr>
-                <w:rFonts w:ascii="Times New Roman" w:hAnsi="Times New Roman" w:cs="Times New Roman"/>
-                <w:color w:val="000000" w:themeColor="text1"/>
-                <w:sz w:val="20"/>
-                <w:szCs w:val="20"/>
-              </w:rPr>
-              <w:t xml:space="preserve"> quality. Contributions of team members - All members should collaborate and contribute equally to the project.</w:t>
+              <w:t>Team work quality. Contributions of team members - All members should collaborate and contribute equally to the project.</w:t>
             </w:r>
           </w:p>
         </w:tc>
@@ -1395,27 +1304,7 @@
                 <w:sz w:val="20"/>
                 <w:szCs w:val="20"/>
               </w:rPr>
-              <w:t>Project report – description of the implemented app, what is implemented, what is missed</w:t>
-            </w:r>
-            <w:proofErr w:type="gramStart"/>
-            <w:r>
-              <w:rPr>
-                <w:rFonts w:ascii="Times New Roman" w:hAnsi="Times New Roman" w:cs="Times New Roman"/>
-                <w:color w:val="000000" w:themeColor="text1"/>
-                <w:sz w:val="20"/>
-                <w:szCs w:val="20"/>
-              </w:rPr>
-              <w:t xml:space="preserve"> ..</w:t>
-            </w:r>
-            <w:proofErr w:type="gramEnd"/>
-            <w:r>
-              <w:rPr>
-                <w:rFonts w:ascii="Times New Roman" w:hAnsi="Times New Roman" w:cs="Times New Roman"/>
-                <w:color w:val="000000" w:themeColor="text1"/>
-                <w:sz w:val="20"/>
-                <w:szCs w:val="20"/>
-              </w:rPr>
-              <w:t xml:space="preserve"> </w:t>
+              <w:t xml:space="preserve">Project report – description of the implemented app, what is implemented, what is missed .. </w:t>
             </w:r>
           </w:p>
         </w:tc>
@@ -1910,21 +1799,7 @@
         <w:rPr>
           <w:rFonts w:ascii="Times New Roman" w:hAnsi="Times New Roman" w:cs="Times New Roman"/>
         </w:rPr>
-        <w:t xml:space="preserve">- The functionality is </w:t>
-      </w:r>
-      <w:proofErr w:type="gramStart"/>
-      <w:r>
-        <w:rPr>
-          <w:rFonts w:ascii="Times New Roman" w:hAnsi="Times New Roman" w:cs="Times New Roman"/>
-        </w:rPr>
-        <w:t>working:</w:t>
-      </w:r>
-      <w:proofErr w:type="gramEnd"/>
-      <w:r>
-        <w:rPr>
-          <w:rFonts w:ascii="Times New Roman" w:hAnsi="Times New Roman" w:cs="Times New Roman"/>
-        </w:rPr>
-        <w:t xml:space="preserve"> you get 70% of the assigned grade. </w:t>
+        <w:t xml:space="preserve">- The functionality is working: you get 70% of the assigned grade. </w:t>
       </w:r>
     </w:p>
     <w:p>
@@ -1941,35 +1816,7 @@
         <w:rPr>
           <w:rFonts w:ascii="Times New Roman" w:hAnsi="Times New Roman" w:cs="Times New Roman"/>
         </w:rPr>
-        <w:t xml:space="preserve">- The functionality is not </w:t>
-      </w:r>
-      <w:proofErr w:type="gramStart"/>
-      <w:r>
-        <w:rPr>
-          <w:rFonts w:ascii="Times New Roman" w:hAnsi="Times New Roman" w:cs="Times New Roman"/>
-        </w:rPr>
-        <w:t>working:</w:t>
-      </w:r>
-      <w:proofErr w:type="gramEnd"/>
-      <w:r>
-        <w:rPr>
-          <w:rFonts w:ascii="Times New Roman" w:hAnsi="Times New Roman" w:cs="Times New Roman"/>
-        </w:rPr>
-        <w:t xml:space="preserve"> you lose 40% of </w:t>
-      </w:r>
-      <w:proofErr w:type="gramStart"/>
-      <w:r>
-        <w:rPr>
-          <w:rFonts w:ascii="Times New Roman" w:hAnsi="Times New Roman" w:cs="Times New Roman"/>
-        </w:rPr>
-        <w:t>assigned</w:t>
-      </w:r>
-      <w:proofErr w:type="gramEnd"/>
-      <w:r>
-        <w:rPr>
-          <w:rFonts w:ascii="Times New Roman" w:hAnsi="Times New Roman" w:cs="Times New Roman"/>
-        </w:rPr>
-        <w:t xml:space="preserve"> grade. </w:t>
+        <w:t xml:space="preserve">- The functionality is not working: you lose 40% of assigned grade. </w:t>
       </w:r>
     </w:p>
     <w:p>
@@ -2451,18 +2298,8 @@
           <w:b/>
           <w:bCs/>
         </w:rPr>
-        <w:t xml:space="preserve">[100-85]. You should work hard to and demonstrate the merits of your application to earn those </w:t>
-      </w:r>
-      <w:proofErr w:type="gramStart"/>
-      <w:r>
-        <w:rPr>
-          <w:rFonts w:ascii="Times New Roman" w:hAnsi="Times New Roman" w:cs="Times New Roman"/>
-          <w:b/>
-          <w:bCs/>
-        </w:rPr>
-        <w:t>grades.+</w:t>
-      </w:r>
-      <w:proofErr w:type="gramEnd"/>
+        <w:t>[100-85]. You should work hard to and demonstrate the merits of your application to earn those grades.+</w:t>
+      </w:r>
     </w:p>
     <w:p>
       <w:pPr>
@@ -2542,13 +2379,37 @@
         <w:t>Description of your proposed platform</w:t>
       </w:r>
     </w:p>
-    <w:p/>
     <w:p>
       <w:r>
-        <w:rPr>
-          <w:highlight w:val="yellow"/>
-        </w:rPr>
-        <w:t>Give an overview of how your application works</w:t>
+        <w:t>Our</w:t>
+      </w:r>
+      <w:r>
+        <w:t xml:space="preserve"> CSE Course Management System is a web application for Qatar University's Computer Science and Engineering department. Users access it through a login page featuring the university logo, with different interfaces for students, instructors, and administrators.</w:t>
+      </w:r>
+    </w:p>
+    <w:p>
+      <w:r>
+        <w:t>Students can search for courses, filter by name and category, and register for classes with automatic prerequisite and capacity checks. They can view their academic progress, including enrolled courses, completed courses, and GPA through the Learning Path page.</w:t>
+      </w:r>
+    </w:p>
+    <w:p>
+      <w:r>
+        <w:t>Instructors can submit teaching preferences and manage grades for their current classes using the grading interface.</w:t>
+      </w:r>
+    </w:p>
+    <w:p>
+      <w:r>
+        <w:t>Administrators can create and manage courses, review instructor preferences, validate or cancel classes, view the weekly schedule, and monitor enrollment status.</w:t>
+      </w:r>
+    </w:p>
+    <w:p>
+      <w:r>
+        <w:t>The system stores data in various JSON files for users, courses, classes, student enrollment, and instructor assignments. All interactions update in real-time with clear feedback for user actions. The clean, intuitive design includes a consistent navigation bar and comprehensive error handling.</w:t>
+      </w:r>
+    </w:p>
+    <w:p>
+      <w:r>
+        <w:t>The application emphasizes data integrity and user experience with role-based interfaces and permissions. Security is maintained through login verification and access control, while the modular design allows for easy maintenance and future enhancements.</w:t>
       </w:r>
     </w:p>
     <w:p>
@@ -2578,6 +2439,7 @@
         <w:t>Use case diagram</w:t>
       </w:r>
     </w:p>
+    <w:p/>
     <w:p>
       <w:pPr>
         <w:pStyle w:val="Heading1"/>
@@ -2639,17 +2501,6 @@
     <w:p/>
     <w:p>
       <w:pPr>
-        <w:jc w:val="center"/>
-      </w:pPr>
-      <w:r>
-        <w:rPr>
-          <w:highlight w:val="yellow"/>
-        </w:rPr>
-        <w:t>Describe your data as a class diagram or Entity Association diagram</w:t>
-      </w:r>
-    </w:p>
-    <w:p>
-      <w:pPr>
         <w:pStyle w:val="Heading1"/>
         <w:numPr>
           <w:ilvl w:val="1"/>
@@ -2662,15 +2513,47 @@
       </w:r>
     </w:p>
     <w:p>
-      <w:pPr>
-        <w:ind w:left="0" w:firstLine="0"/>
-        <w:jc w:val="center"/>
-      </w:pPr>
-      <w:r>
-        <w:t>List all the methods (functions) to query your data entities</w:t>
+      <w:r>
+        <w:rPr>
+          <w:noProof/>
+        </w:rPr>
+        <w:drawing>
+          <wp:inline distT="0" distB="0" distL="0" distR="0" wp14:anchorId="575442AE" wp14:editId="63A7589B">
+            <wp:extent cx="6858000" cy="4398010"/>
+            <wp:effectExtent l="0" t="0" r="0" b="2540"/>
+            <wp:docPr id="1942017241" name="Picture 1" descr="A screenshot of a computer screen&#10;&#10;AI-generated content may be incorrect."/>
+            <wp:cNvGraphicFramePr>
+              <a:graphicFrameLocks xmlns:a="http://schemas.openxmlformats.org/drawingml/2006/main" noChangeAspect="1"/>
+            </wp:cNvGraphicFramePr>
+            <a:graphic xmlns:a="http://schemas.openxmlformats.org/drawingml/2006/main">
+              <a:graphicData uri="http://schemas.openxmlformats.org/drawingml/2006/picture">
+                <pic:pic xmlns:pic="http://schemas.openxmlformats.org/drawingml/2006/picture">
+                  <pic:nvPicPr>
+                    <pic:cNvPr id="1942017241" name="Picture 1" descr="A screenshot of a computer screen&#10;&#10;AI-generated content may be incorrect."/>
+                    <pic:cNvPicPr/>
+                  </pic:nvPicPr>
+                  <pic:blipFill>
+                    <a:blip r:embed="rId13"/>
+                    <a:stretch>
+                      <a:fillRect/>
+                    </a:stretch>
+                  </pic:blipFill>
+                  <pic:spPr>
+                    <a:xfrm>
+                      <a:off x="0" y="0"/>
+                      <a:ext cx="6858000" cy="4398010"/>
+                    </a:xfrm>
+                    <a:prstGeom prst="rect">
+                      <a:avLst/>
+                    </a:prstGeom>
+                  </pic:spPr>
+                </pic:pic>
+              </a:graphicData>
+            </a:graphic>
+          </wp:inline>
+        </w:drawing>
       </w:r>
     </w:p>
-    <w:p/>
     <w:p>
       <w:pPr>
         <w:pStyle w:val="Heading1"/>
@@ -2699,6 +2582,48 @@
       </w:r>
     </w:p>
     <w:p>
+      <w:r>
+        <w:rPr>
+          <w:noProof/>
+        </w:rPr>
+        <w:drawing>
+          <wp:inline distT="0" distB="0" distL="0" distR="0" wp14:anchorId="0A10D486" wp14:editId="1B366B63">
+            <wp:extent cx="6858000" cy="2439670"/>
+            <wp:effectExtent l="0" t="0" r="0" b="0"/>
+            <wp:docPr id="184286255" name="Picture 1" descr="A diagram of a company&#10;&#10;AI-generated content may be incorrect."/>
+            <wp:cNvGraphicFramePr>
+              <a:graphicFrameLocks xmlns:a="http://schemas.openxmlformats.org/drawingml/2006/main" noChangeAspect="1"/>
+            </wp:cNvGraphicFramePr>
+            <a:graphic xmlns:a="http://schemas.openxmlformats.org/drawingml/2006/main">
+              <a:graphicData uri="http://schemas.openxmlformats.org/drawingml/2006/picture">
+                <pic:pic xmlns:pic="http://schemas.openxmlformats.org/drawingml/2006/picture">
+                  <pic:nvPicPr>
+                    <pic:cNvPr id="184286255" name="Picture 1" descr="A diagram of a company&#10;&#10;AI-generated content may be incorrect."/>
+                    <pic:cNvPicPr/>
+                  </pic:nvPicPr>
+                  <pic:blipFill>
+                    <a:blip r:embed="rId14"/>
+                    <a:stretch>
+                      <a:fillRect/>
+                    </a:stretch>
+                  </pic:blipFill>
+                  <pic:spPr>
+                    <a:xfrm>
+                      <a:off x="0" y="0"/>
+                      <a:ext cx="6858000" cy="2439670"/>
+                    </a:xfrm>
+                    <a:prstGeom prst="rect">
+                      <a:avLst/>
+                    </a:prstGeom>
+                  </pic:spPr>
+                </pic:pic>
+              </a:graphicData>
+            </a:graphic>
+          </wp:inline>
+        </w:drawing>
+      </w:r>
+    </w:p>
+    <w:p>
       <w:pPr>
         <w:pStyle w:val="Heading1"/>
         <w:numPr>
@@ -2708,15 +2633,8 @@
         <w:spacing w:before="240" w:after="120"/>
       </w:pPr>
       <w:r>
-        <w:t xml:space="preserve">Unimplemented use-cases and </w:t>
-      </w:r>
-      <w:proofErr w:type="gramStart"/>
-      <w:r>
-        <w:t>not functioning</w:t>
-      </w:r>
-      <w:proofErr w:type="gramEnd"/>
-      <w:r>
-        <w:t xml:space="preserve"> parts</w:t>
+        <w:lastRenderedPageBreak/>
+        <w:t>Unimplemented use-cases and not functioning parts</w:t>
       </w:r>
     </w:p>
     <w:p/>
@@ -2731,7 +2649,6 @@
         <w:ind w:left="357" w:hanging="357"/>
       </w:pPr>
       <w:r>
-        <w:lastRenderedPageBreak/>
         <w:t>Testing</w:t>
       </w:r>
     </w:p>
@@ -2759,6 +2676,9 @@
         </w:rPr>
       </w:pPr>
       <w:r>
+        <w:rPr>
+          <w:noProof/>
+        </w:rPr>
         <w:drawing>
           <wp:inline distT="0" distB="0" distL="0" distR="0" wp14:anchorId="1536E306" wp14:editId="3F081D9A">
             <wp:extent cx="3030279" cy="2652045"/>
@@ -2775,7 +2695,7 @@
                     <pic:cNvPicPr/>
                   </pic:nvPicPr>
                   <pic:blipFill>
-                    <a:blip r:embed="rId13"/>
+                    <a:blip r:embed="rId15"/>
                     <a:stretch>
                       <a:fillRect/>
                     </a:stretch>
@@ -2802,6 +2722,9 @@
         <w:t xml:space="preserve"> </w:t>
       </w:r>
       <w:r>
+        <w:rPr>
+          <w:noProof/>
+        </w:rPr>
         <w:drawing>
           <wp:inline distT="0" distB="0" distL="0" distR="0" wp14:anchorId="4E93267B" wp14:editId="4A994C94">
             <wp:extent cx="2426876" cy="2700655"/>
@@ -2818,7 +2741,7 @@
                     <pic:cNvPicPr/>
                   </pic:nvPicPr>
                   <pic:blipFill>
-                    <a:blip r:embed="rId14"/>
+                    <a:blip r:embed="rId16"/>
                     <a:stretch>
                       <a:fillRect/>
                     </a:stretch>
@@ -2864,7 +2787,7 @@
                     <pic:cNvPicPr/>
                   </pic:nvPicPr>
                   <pic:blipFill>
-                    <a:blip r:embed="rId15"/>
+                    <a:blip r:embed="rId17"/>
                     <a:stretch>
                       <a:fillRect/>
                     </a:stretch>
@@ -2910,7 +2833,7 @@
                     <pic:cNvPicPr/>
                   </pic:nvPicPr>
                   <pic:blipFill>
-                    <a:blip r:embed="rId16"/>
+                    <a:blip r:embed="rId18"/>
                     <a:stretch>
                       <a:fillRect/>
                     </a:stretch>
@@ -2936,6 +2859,10 @@
         <w:ind w:left="730"/>
       </w:pPr>
       <w:r>
+        <w:rPr>
+          <w:noProof/>
+        </w:rPr>
+        <w:lastRenderedPageBreak/>
         <w:drawing>
           <wp:inline distT="0" distB="0" distL="0" distR="0" wp14:anchorId="26BCA7B5" wp14:editId="6CA27212">
             <wp:extent cx="3048000" cy="2050723"/>
@@ -2952,7 +2879,7 @@
                     <pic:cNvPicPr/>
                   </pic:nvPicPr>
                   <pic:blipFill>
-                    <a:blip r:embed="rId17"/>
+                    <a:blip r:embed="rId19"/>
                     <a:stretch>
                       <a:fillRect/>
                     </a:stretch>
@@ -2979,6 +2906,9 @@
         <w:t xml:space="preserve"> </w:t>
       </w:r>
       <w:r>
+        <w:rPr>
+          <w:noProof/>
+        </w:rPr>
         <w:drawing>
           <wp:inline distT="0" distB="0" distL="0" distR="0" wp14:anchorId="698918DA" wp14:editId="5E512E75">
             <wp:extent cx="2971800" cy="2060575"/>
@@ -2995,7 +2925,7 @@
                     <pic:cNvPicPr/>
                   </pic:nvPicPr>
                   <pic:blipFill>
-                    <a:blip r:embed="rId18"/>
+                    <a:blip r:embed="rId20"/>
                     <a:stretch>
                       <a:fillRect/>
                     </a:stretch>
@@ -3016,6 +2946,9 @@
         </w:drawing>
       </w:r>
       <w:r>
+        <w:rPr>
+          <w:noProof/>
+        </w:rPr>
         <w:drawing>
           <wp:inline distT="0" distB="0" distL="0" distR="0" wp14:anchorId="00EF9CE5" wp14:editId="146E8C44">
             <wp:extent cx="3009900" cy="1819016"/>
@@ -3032,7 +2965,7 @@
                     <pic:cNvPicPr/>
                   </pic:nvPicPr>
                   <pic:blipFill>
-                    <a:blip r:embed="rId19"/>
+                    <a:blip r:embed="rId21"/>
                     <a:stretch>
                       <a:fillRect/>
                     </a:stretch>
@@ -3078,7 +3011,7 @@
                     <pic:cNvPicPr/>
                   </pic:nvPicPr>
                   <pic:blipFill>
-                    <a:blip r:embed="rId20"/>
+                    <a:blip r:embed="rId22"/>
                     <a:stretch>
                       <a:fillRect/>
                     </a:stretch>
@@ -3337,9 +3270,9 @@
     </w:tbl>
     <w:p/>
     <w:sectPr>
-      <w:footerReference w:type="even" r:id="rId21"/>
-      <w:footerReference w:type="default" r:id="rId22"/>
-      <w:footerReference w:type="first" r:id="rId23"/>
+      <w:footerReference w:type="even" r:id="rId23"/>
+      <w:footerReference w:type="default" r:id="rId24"/>
+      <w:footerReference w:type="first" r:id="rId25"/>
       <w:pgSz w:w="12240" w:h="15840"/>
       <w:pgMar w:top="720" w:right="720" w:bottom="720" w:left="720" w:header="720" w:footer="719" w:gutter="0"/>
       <w:cols w:space="720"/>
@@ -3558,7 +3491,7 @@
     <mc:AlternateContent>
       <mc:Choice Requires="v">
         <w:pict>
-          <v:shapetype w14:anchorId="40BE9D69" id="_x0000_t75" coordsize="21600,21600" o:spt="75" o:preferrelative="t" path="m@4@5l@4@11@9@11@9@5xe" filled="f" stroked="f">
+          <v:shapetype w14:anchorId="159DB601" id="_x0000_t75" coordsize="21600,21600" o:spt="75" o:preferrelative="t" path="m@4@5l@4@11@9@11@9@5xe" filled="f" stroked="f">
             <v:stroke joinstyle="miter"/>
             <v:formulas>
               <v:f eqn="if lineDrawn pixelLineWidth 0"/>
@@ -3577,17 +3510,17 @@
             <v:path o:extrusionok="f" gradientshapeok="t" o:connecttype="rect"/>
             <o:lock v:ext="edit" aspectratio="t"/>
           </v:shapetype>
-          <v:shape id="Picture 515805728" o:spid="_x0000_i1025" type="#_x0000_t75" style="width:14pt;height:14pt;visibility:visible;mso-wrap-style:square">
+          <v:shape id="Picture 1764707949" o:spid="_x0000_i1025" type="#_x0000_t75" style="width:14pt;height:14pt;visibility:visible;mso-wrap-style:square">
             <v:imagedata r:id="rId1" o:title=""/>
           </v:shape>
         </w:pict>
       </mc:Choice>
       <mc:Fallback>
         <w:drawing>
-          <wp:inline distT="0" distB="0" distL="0" distR="0" wp14:anchorId="32D38A4D" wp14:editId="786D8429">
+          <wp:inline distT="0" distB="0" distL="0" distR="0" wp14:anchorId="1CAD06E8" wp14:editId="34EEC12F">
             <wp:extent cx="177800" cy="177800"/>
             <wp:effectExtent l="0" t="0" r="0" b="0"/>
-            <wp:docPr id="515805728" name="Picture 515805728"/>
+            <wp:docPr id="1764707949" name="Picture 1764707949"/>
             <wp:cNvGraphicFramePr>
               <a:graphicFrameLocks xmlns:a="http://schemas.openxmlformats.org/drawingml/2006/main" noChangeAspect="1"/>
             </wp:cNvGraphicFramePr>
@@ -9312,6 +9245,15 @@
 </file>
 
 <file path=customXml/item1.xml><?xml version="1.0" encoding="utf-8"?>
+<?mso-contentType ?>
+<FormTemplates xmlns="http://schemas.microsoft.com/sharepoint/v3/contenttype/forms">
+  <Display>DocumentLibraryForm</Display>
+  <Edit>DocumentLibraryForm</Edit>
+  <New>DocumentLibraryForm</New>
+</FormTemplates>
+</file>
+
+<file path=customXml/item2.xml><?xml version="1.0" encoding="utf-8"?>
 <ct:contentTypeSchema xmlns:ct="http://schemas.microsoft.com/office/2006/metadata/contentType" xmlns:ma="http://schemas.microsoft.com/office/2006/metadata/properties/metaAttributes" ct:_="" ma:_="" ma:contentTypeName="Document" ma:contentTypeID="0x01010085BEF43317B4F840AC0C37E0D977D82E" ma:contentTypeVersion="12" ma:contentTypeDescription="Create a new document." ma:contentTypeScope="" ma:versionID="a2338617cbfbb51b2c0d33e4cb8684b1">
   <xsd:schema xmlns:xsd="http://www.w3.org/2001/XMLSchema" xmlns:xs="http://www.w3.org/2001/XMLSchema" xmlns:p="http://schemas.microsoft.com/office/2006/metadata/properties" xmlns:ns2="ff4433bc-22a3-4dac-805f-c635aff40461" xmlns:ns3="692651b8-6577-4651-a352-3b631599c082" targetNamespace="http://schemas.microsoft.com/office/2006/metadata/properties" ma:root="true" ma:fieldsID="0f93a4889667a75834aa97db9b978e47" ns2:_="" ns3:_="">
     <xsd:import namespace="ff4433bc-22a3-4dac-805f-c635aff40461"/>
@@ -9512,20 +9454,7 @@
 </ct:contentTypeSchema>
 </file>
 
-<file path=customXml/item2.xml><?xml version="1.0" encoding="utf-8"?>
-<?mso-contentType ?>
-<FormTemplates xmlns="http://schemas.microsoft.com/sharepoint/v3/contenttype/forms">
-  <Display>DocumentLibraryForm</Display>
-  <Edit>DocumentLibraryForm</Edit>
-  <New>DocumentLibraryForm</New>
-</FormTemplates>
-</file>
-
 <file path=customXml/item3.xml><?xml version="1.0" encoding="utf-8"?>
-<b:Sources xmlns:b="http://schemas.openxmlformats.org/officeDocument/2006/bibliography" xmlns="http://schemas.openxmlformats.org/officeDocument/2006/bibliography" SelectedStyle="\APASixthEditionOfficeOnline.xsl" StyleName="APA" Version="6"/>
-</file>
-
-<file path=customXml/item4.xml><?xml version="1.0" encoding="utf-8"?>
 <p:properties xmlns:p="http://schemas.microsoft.com/office/2006/metadata/properties" xmlns:xsi="http://www.w3.org/2001/XMLSchema-instance" xmlns:pc="http://schemas.microsoft.com/office/infopath/2007/PartnerControls">
   <documentManagement>
     <TaxCatchAll xmlns="692651b8-6577-4651-a352-3b631599c082" xsi:nil="true"/>
@@ -9536,7 +9465,19 @@
 </p:properties>
 </file>
 
+<file path=customXml/item4.xml><?xml version="1.0" encoding="utf-8"?>
+<b:Sources xmlns:b="http://schemas.openxmlformats.org/officeDocument/2006/bibliography" xmlns="http://schemas.openxmlformats.org/officeDocument/2006/bibliography" SelectedStyle="\APASixthEditionOfficeOnline.xsl" StyleName="APA" Version="6"/>
+</file>
+
 <file path=customXml/itemProps1.xml><?xml version="1.0" encoding="utf-8"?>
+<ds:datastoreItem xmlns:ds="http://schemas.openxmlformats.org/officeDocument/2006/customXml" ds:itemID="{899977B6-4170-4EBB-8EC3-1772808F953C}">
+  <ds:schemaRefs>
+    <ds:schemaRef ds:uri="http://schemas.microsoft.com/sharepoint/v3/contenttype/forms"/>
+  </ds:schemaRefs>
+</ds:datastoreItem>
+</file>
+
+<file path=customXml/itemProps2.xml><?xml version="1.0" encoding="utf-8"?>
 <ds:datastoreItem xmlns:ds="http://schemas.openxmlformats.org/officeDocument/2006/customXml" ds:itemID="{336297D6-A3E4-40E3-8F58-11EE5F3018B5}">
   <ds:schemaRefs>
     <ds:schemaRef ds:uri="http://schemas.microsoft.com/office/2006/metadata/contentType"/>
@@ -9555,23 +9496,7 @@
 </ds:datastoreItem>
 </file>
 
-<file path=customXml/itemProps2.xml><?xml version="1.0" encoding="utf-8"?>
-<ds:datastoreItem xmlns:ds="http://schemas.openxmlformats.org/officeDocument/2006/customXml" ds:itemID="{899977B6-4170-4EBB-8EC3-1772808F953C}">
-  <ds:schemaRefs>
-    <ds:schemaRef ds:uri="http://schemas.microsoft.com/sharepoint/v3/contenttype/forms"/>
-  </ds:schemaRefs>
-</ds:datastoreItem>
-</file>
-
 <file path=customXml/itemProps3.xml><?xml version="1.0" encoding="utf-8"?>
-<ds:datastoreItem xmlns:ds="http://schemas.openxmlformats.org/officeDocument/2006/customXml" ds:itemID="{EC954A2E-28E0-4668-92E6-EA1FC2D35EDB}">
-  <ds:schemaRefs>
-    <ds:schemaRef ds:uri="http://schemas.openxmlformats.org/officeDocument/2006/bibliography"/>
-  </ds:schemaRefs>
-</ds:datastoreItem>
-</file>
-
-<file path=customXml/itemProps4.xml><?xml version="1.0" encoding="utf-8"?>
 <ds:datastoreItem xmlns:ds="http://schemas.openxmlformats.org/officeDocument/2006/customXml" ds:itemID="{E9D8FE69-F782-45F1-BD7D-38E143528BC3}">
   <ds:schemaRefs>
     <ds:schemaRef ds:uri="http://schemas.microsoft.com/office/2006/metadata/properties"/>
@@ -9580,4 +9505,12 @@
     <ds:schemaRef ds:uri="ff4433bc-22a3-4dac-805f-c635aff40461"/>
   </ds:schemaRefs>
 </ds:datastoreItem>
+</file>
+
+<file path=customXml/itemProps4.xml><?xml version="1.0" encoding="utf-8"?>
+<ds:datastoreItem xmlns:ds="http://schemas.openxmlformats.org/officeDocument/2006/customXml" ds:itemID="{EC954A2E-28E0-4668-92E6-EA1FC2D35EDB}">
+  <ds:schemaRefs>
+    <ds:schemaRef ds:uri="http://schemas.openxmlformats.org/officeDocument/2006/bibliography"/>
+  </ds:schemaRefs>
+</ds:datastoreItem>
 </file>
</xml_diff>

<commit_message>
Added all student info and github link
</commit_message>
<xml_diff>
--- a/CMPS350_Project Phase 1_Report.docx
+++ b/CMPS350_Project Phase 1_Report.docx
@@ -198,6 +198,7 @@
                 <w:color w:val="auto"/>
                 <w:sz w:val="24"/>
                 <w:szCs w:val="24"/>
+                <w:lang w:val="en-HK"/>
               </w:rPr>
             </w:pPr>
             <w:r>
@@ -206,35 +207,31 @@
                 <w:color w:val="auto"/>
                 <w:sz w:val="24"/>
                 <w:szCs w:val="24"/>
-              </w:rPr>
-              <w:t xml:space="preserve">Ali Adel Abouelkhir </w:t>
+                <w:lang w:val="en-HK"/>
+              </w:rPr>
+              <w:t xml:space="preserve">Ali Adel </w:t>
             </w:r>
+            <w:proofErr w:type="spellStart"/>
             <w:r>
               <w:rPr>
                 <w:bCs/>
                 <w:color w:val="auto"/>
                 <w:sz w:val="24"/>
                 <w:szCs w:val="24"/>
-              </w:rPr>
-              <w:t>(</w:t>
+                <w:lang w:val="en-HK"/>
+              </w:rPr>
+              <w:t>Abouelkhir</w:t>
             </w:r>
+            <w:proofErr w:type="spellEnd"/>
             <w:r>
               <w:rPr>
                 <w:bCs/>
                 <w:color w:val="auto"/>
                 <w:sz w:val="24"/>
                 <w:szCs w:val="24"/>
-              </w:rPr>
-              <w:t>202206551</w:t>
-            </w:r>
-            <w:r>
-              <w:rPr>
-                <w:bCs/>
-                <w:color w:val="auto"/>
-                <w:sz w:val="24"/>
-                <w:szCs w:val="24"/>
-              </w:rPr>
-              <w:t>)</w:t>
+                <w:lang w:val="en-HK"/>
+              </w:rPr>
+              <w:t xml:space="preserve"> (QUID: 202206551)</w:t>
             </w:r>
           </w:p>
           <w:p>
@@ -247,6 +244,7 @@
                 <w:color w:val="auto"/>
                 <w:sz w:val="24"/>
                 <w:szCs w:val="24"/>
+                <w:lang w:val="en-HK"/>
               </w:rPr>
             </w:pPr>
             <w:r>
@@ -255,8 +253,31 @@
                 <w:color w:val="auto"/>
                 <w:sz w:val="24"/>
                 <w:szCs w:val="24"/>
-              </w:rPr>
-              <w:t>Student2 full name (StudentId)</w:t>
+                <w:lang w:val="en-HK"/>
+              </w:rPr>
+              <w:t xml:space="preserve">Alwaleed </w:t>
+            </w:r>
+            <w:proofErr w:type="spellStart"/>
+            <w:r>
+              <w:rPr>
+                <w:bCs/>
+                <w:color w:val="auto"/>
+                <w:sz w:val="24"/>
+                <w:szCs w:val="24"/>
+                <w:lang w:val="en-HK"/>
+              </w:rPr>
+              <w:t>Sarieh</w:t>
+            </w:r>
+            <w:proofErr w:type="spellEnd"/>
+            <w:r>
+              <w:rPr>
+                <w:bCs/>
+                <w:color w:val="auto"/>
+                <w:sz w:val="24"/>
+                <w:szCs w:val="24"/>
+                <w:lang w:val="en-HK"/>
+              </w:rPr>
+              <w:t xml:space="preserve"> Daher (QUID: 201807916)</w:t>
             </w:r>
           </w:p>
           <w:p>
@@ -269,6 +290,7 @@
                 <w:color w:val="auto"/>
                 <w:sz w:val="24"/>
                 <w:szCs w:val="24"/>
+                <w:lang w:val="en-HK"/>
               </w:rPr>
             </w:pPr>
             <w:r>
@@ -277,8 +299,33 @@
                 <w:color w:val="auto"/>
                 <w:sz w:val="24"/>
                 <w:szCs w:val="24"/>
-              </w:rPr>
-              <w:t>Student3 full name (StudentId)</w:t>
+                <w:lang w:val="en-HK"/>
+              </w:rPr>
+              <w:t>Xiaofan Cao (QUID: 202314895)</w:t>
+            </w:r>
+          </w:p>
+          <w:p>
+            <w:pPr>
+              <w:spacing w:after="0" w:line="240" w:lineRule="auto"/>
+              <w:ind w:left="0" w:firstLine="0"/>
+              <w:jc w:val="left"/>
+              <w:rPr>
+                <w:bCs/>
+                <w:color w:val="auto"/>
+                <w:sz w:val="24"/>
+                <w:szCs w:val="24"/>
+                <w:lang w:val="en-HK"/>
+              </w:rPr>
+            </w:pPr>
+            <w:r>
+              <w:rPr>
+                <w:bCs/>
+                <w:color w:val="auto"/>
+                <w:sz w:val="24"/>
+                <w:szCs w:val="24"/>
+                <w:lang w:val="en-HK"/>
+              </w:rPr>
+              <w:t>Yousef Elsherif (QUID: 202206988)</w:t>
             </w:r>
           </w:p>
           <w:p>
@@ -317,14 +364,14 @@
               <w:spacing w:after="0"/>
               <w:ind w:left="0" w:right="249" w:firstLine="0"/>
               <w:jc w:val="left"/>
-              <w:rPr>
-                <w:bCs/>
-                <w:color w:val="auto"/>
-                <w:sz w:val="24"/>
-                <w:szCs w:val="24"/>
-              </w:rPr>
             </w:pPr>
             <w:hyperlink r:id="rId11" w:history="1">
+              <w:r>
+                <w:rPr>
+                  <w:rStyle w:val="Hyperlink"/>
+                </w:rPr>
+                <w:t>a</w:t>
+              </w:r>
               <w:r>
                 <w:rPr>
                   <w:rStyle w:val="Hyperlink"/>
@@ -332,7 +379,7 @@
                   <w:sz w:val="24"/>
                   <w:szCs w:val="24"/>
                 </w:rPr>
-                <w:t>Aa2206551@qu.edu.qa</w:t>
+                <w:t>a2206551@qu.edu.qa</w:t>
               </w:r>
             </w:hyperlink>
             <w:r>
@@ -342,8 +389,35 @@
                 <w:sz w:val="24"/>
                 <w:szCs w:val="24"/>
               </w:rPr>
+              <w:t>;</w:t>
+            </w:r>
+            <w:r>
               <w:t xml:space="preserve"> </w:t>
             </w:r>
+          </w:p>
+          <w:p>
+            <w:pPr>
+              <w:spacing w:after="0"/>
+              <w:ind w:left="0" w:right="249" w:firstLine="0"/>
+              <w:jc w:val="left"/>
+              <w:rPr>
+                <w:bCs/>
+                <w:color w:val="auto"/>
+                <w:sz w:val="24"/>
+                <w:szCs w:val="24"/>
+              </w:rPr>
+            </w:pPr>
+            <w:hyperlink r:id="rId12" w:history="1">
+              <w:r>
+                <w:rPr>
+                  <w:rStyle w:val="Hyperlink"/>
+                  <w:bCs/>
+                  <w:sz w:val="24"/>
+                  <w:szCs w:val="24"/>
+                </w:rPr>
+                <w:t>as1807916@qu.edu.qa</w:t>
+              </w:r>
+            </w:hyperlink>
             <w:r>
               <w:rPr>
                 <w:bCs/>
@@ -360,20 +434,87 @@
               <w:ind w:left="0" w:right="249" w:firstLine="0"/>
               <w:jc w:val="left"/>
               <w:rPr>
-                <w:b/>
-                <w:bCs/>
-                <w:sz w:val="28"/>
-                <w:szCs w:val="28"/>
-              </w:rPr>
-            </w:pPr>
-            <w:r>
-              <w:rPr>
                 <w:bCs/>
                 <w:color w:val="auto"/>
                 <w:sz w:val="24"/>
                 <w:szCs w:val="24"/>
               </w:rPr>
-              <w:t xml:space="preserve"> student2@student.qu.edu.qa; student3@student.qu.edu.qa;</w:t>
+            </w:pPr>
+            <w:r>
+              <w:rPr>
+                <w:bCs/>
+                <w:color w:val="auto"/>
+                <w:sz w:val="24"/>
+                <w:szCs w:val="24"/>
+              </w:rPr>
+              <w:t>xc2314895@</w:t>
+            </w:r>
+            <w:r>
+              <w:rPr>
+                <w:bCs/>
+                <w:color w:val="auto"/>
+                <w:sz w:val="24"/>
+                <w:szCs w:val="24"/>
+              </w:rPr>
+              <w:t xml:space="preserve"> </w:t>
+            </w:r>
+            <w:r>
+              <w:rPr>
+                <w:bCs/>
+                <w:color w:val="auto"/>
+                <w:sz w:val="24"/>
+                <w:szCs w:val="24"/>
+              </w:rPr>
+              <w:t>qu.edu.qa</w:t>
+            </w:r>
+            <w:r>
+              <w:rPr>
+                <w:bCs/>
+                <w:color w:val="auto"/>
+                <w:sz w:val="24"/>
+                <w:szCs w:val="24"/>
+              </w:rPr>
+              <w:t>;</w:t>
+            </w:r>
+          </w:p>
+          <w:p>
+            <w:pPr>
+              <w:spacing w:after="0"/>
+              <w:ind w:left="0" w:right="249" w:firstLine="0"/>
+              <w:jc w:val="left"/>
+              <w:rPr>
+                <w:bCs/>
+                <w:color w:val="auto"/>
+                <w:sz w:val="24"/>
+                <w:szCs w:val="24"/>
+              </w:rPr>
+            </w:pPr>
+            <w:r>
+              <w:rPr>
+                <w:bCs/>
+                <w:color w:val="auto"/>
+                <w:sz w:val="24"/>
+                <w:szCs w:val="24"/>
+              </w:rPr>
+              <w:t>ye2206988@</w:t>
+            </w:r>
+            <w:r>
+              <w:rPr>
+                <w:bCs/>
+                <w:color w:val="auto"/>
+                <w:sz w:val="24"/>
+                <w:szCs w:val="24"/>
+              </w:rPr>
+              <w:t xml:space="preserve"> </w:t>
+            </w:r>
+            <w:r>
+              <w:rPr>
+                <w:bCs/>
+                <w:color w:val="auto"/>
+                <w:sz w:val="24"/>
+                <w:szCs w:val="24"/>
+              </w:rPr>
+              <w:t>qu.edu.qa</w:t>
             </w:r>
           </w:p>
         </w:tc>
@@ -427,15 +568,7 @@
                 <w:sz w:val="28"/>
                 <w:szCs w:val="28"/>
               </w:rPr>
-              <w:t xml:space="preserve">Give a public link to you code </w:t>
-            </w:r>
-            <w:r>
-              <w:rPr>
-                <w:color w:val="FF0000"/>
-                <w:sz w:val="28"/>
-                <w:szCs w:val="28"/>
-              </w:rPr>
-              <w:t>(It is not acceptable to send codes by email)</w:t>
+              <w:t>https://github.com/WanderingSnail/CSE-Couse-Management-System.git</w:t>
             </w:r>
           </w:p>
         </w:tc>
@@ -1520,6 +1653,7 @@
                 <w:sz w:val="20"/>
                 <w:szCs w:val="20"/>
               </w:rPr>
+              <w:lastRenderedPageBreak/>
               <w:t>Plagiarism, outsourcing, free riders</w:t>
             </w:r>
           </w:p>
@@ -2375,16 +2509,12 @@
         <w:ind w:left="357" w:hanging="357"/>
       </w:pPr>
       <w:r>
-        <w:lastRenderedPageBreak/>
         <w:t>Description of your proposed platform</w:t>
       </w:r>
     </w:p>
     <w:p>
       <w:r>
-        <w:t>Our</w:t>
-      </w:r>
-      <w:r>
-        <w:t xml:space="preserve"> CSE Course Management System is a web application for Qatar University's Computer Science and Engineering department. Users access it through a login page featuring the university logo, with different interfaces for students, instructors, and administrators.</w:t>
+        <w:t>Our CSE Course Management System is a web application for Qatar University's Computer Science and Engineering department. Users access it through a login page featuring the university logo, with different interfaces for students, instructors, and administrators.</w:t>
       </w:r>
     </w:p>
     <w:p>
@@ -2450,6 +2580,7 @@
         <w:spacing w:before="240" w:after="120"/>
       </w:pPr>
       <w:r>
+        <w:lastRenderedPageBreak/>
         <w:t>Entities</w:t>
       </w:r>
       <w:r>
@@ -2477,7 +2608,7 @@
                     <pic:cNvPicPr/>
                   </pic:nvPicPr>
                   <pic:blipFill>
-                    <a:blip r:embed="rId12"/>
+                    <a:blip r:embed="rId13"/>
                     <a:stretch>
                       <a:fillRect/>
                     </a:stretch>
@@ -2509,6 +2640,7 @@
         <w:spacing w:before="240" w:after="120"/>
       </w:pPr>
       <w:r>
+        <w:lastRenderedPageBreak/>
         <w:t xml:space="preserve">Web API class </w:t>
       </w:r>
     </w:p>
@@ -2533,7 +2665,7 @@
                     <pic:cNvPicPr/>
                   </pic:nvPicPr>
                   <pic:blipFill>
-                    <a:blip r:embed="rId13"/>
+                    <a:blip r:embed="rId14"/>
                     <a:stretch>
                       <a:fillRect/>
                     </a:stretch>
@@ -2602,7 +2734,7 @@
                     <pic:cNvPicPr/>
                   </pic:nvPicPr>
                   <pic:blipFill>
-                    <a:blip r:embed="rId14"/>
+                    <a:blip r:embed="rId15"/>
                     <a:stretch>
                       <a:fillRect/>
                     </a:stretch>
@@ -2633,7 +2765,6 @@
         <w:spacing w:before="240" w:after="120"/>
       </w:pPr>
       <w:r>
-        <w:lastRenderedPageBreak/>
         <w:t>Unimplemented use-cases and not functioning parts</w:t>
       </w:r>
     </w:p>
@@ -2649,6 +2780,7 @@
         <w:ind w:left="357" w:hanging="357"/>
       </w:pPr>
       <w:r>
+        <w:lastRenderedPageBreak/>
         <w:t>Testing</w:t>
       </w:r>
     </w:p>
@@ -2695,7 +2827,7 @@
                     <pic:cNvPicPr/>
                   </pic:nvPicPr>
                   <pic:blipFill>
-                    <a:blip r:embed="rId15"/>
+                    <a:blip r:embed="rId16"/>
                     <a:stretch>
                       <a:fillRect/>
                     </a:stretch>
@@ -2741,7 +2873,7 @@
                     <pic:cNvPicPr/>
                   </pic:nvPicPr>
                   <pic:blipFill>
-                    <a:blip r:embed="rId16"/>
+                    <a:blip r:embed="rId17"/>
                     <a:stretch>
                       <a:fillRect/>
                     </a:stretch>
@@ -2787,7 +2919,7 @@
                     <pic:cNvPicPr/>
                   </pic:nvPicPr>
                   <pic:blipFill>
-                    <a:blip r:embed="rId17"/>
+                    <a:blip r:embed="rId18"/>
                     <a:stretch>
                       <a:fillRect/>
                     </a:stretch>
@@ -2833,7 +2965,7 @@
                     <pic:cNvPicPr/>
                   </pic:nvPicPr>
                   <pic:blipFill>
-                    <a:blip r:embed="rId18"/>
+                    <a:blip r:embed="rId19"/>
                     <a:stretch>
                       <a:fillRect/>
                     </a:stretch>
@@ -2879,7 +3011,7 @@
                     <pic:cNvPicPr/>
                   </pic:nvPicPr>
                   <pic:blipFill>
-                    <a:blip r:embed="rId19"/>
+                    <a:blip r:embed="rId20"/>
                     <a:stretch>
                       <a:fillRect/>
                     </a:stretch>
@@ -2925,7 +3057,7 @@
                     <pic:cNvPicPr/>
                   </pic:nvPicPr>
                   <pic:blipFill>
-                    <a:blip r:embed="rId20"/>
+                    <a:blip r:embed="rId21"/>
                     <a:stretch>
                       <a:fillRect/>
                     </a:stretch>
@@ -2965,7 +3097,7 @@
                     <pic:cNvPicPr/>
                   </pic:nvPicPr>
                   <pic:blipFill>
-                    <a:blip r:embed="rId21"/>
+                    <a:blip r:embed="rId22"/>
                     <a:stretch>
                       <a:fillRect/>
                     </a:stretch>
@@ -3011,7 +3143,7 @@
                     <pic:cNvPicPr/>
                   </pic:nvPicPr>
                   <pic:blipFill>
-                    <a:blip r:embed="rId22"/>
+                    <a:blip r:embed="rId23"/>
                     <a:stretch>
                       <a:fillRect/>
                     </a:stretch>
@@ -3270,9 +3402,9 @@
     </w:tbl>
     <w:p/>
     <w:sectPr>
-      <w:footerReference w:type="even" r:id="rId23"/>
-      <w:footerReference w:type="default" r:id="rId24"/>
-      <w:footerReference w:type="first" r:id="rId25"/>
+      <w:footerReference w:type="even" r:id="rId24"/>
+      <w:footerReference w:type="default" r:id="rId25"/>
+      <w:footerReference w:type="first" r:id="rId26"/>
       <w:pgSz w:w="12240" w:h="15840"/>
       <w:pgMar w:top="720" w:right="720" w:bottom="720" w:left="720" w:header="720" w:footer="719" w:gutter="0"/>
       <w:cols w:space="720"/>
@@ -3491,7 +3623,7 @@
     <mc:AlternateContent>
       <mc:Choice Requires="v">
         <w:pict>
-          <v:shapetype w14:anchorId="159DB601" id="_x0000_t75" coordsize="21600,21600" o:spt="75" o:preferrelative="t" path="m@4@5l@4@11@9@11@9@5xe" filled="f" stroked="f">
+          <v:shapetype w14:anchorId="1C141919" id="_x0000_t75" coordsize="21600,21600" o:spt="75" o:preferrelative="t" path="m@4@5l@4@11@9@11@9@5xe" filled="f" stroked="f">
             <v:stroke joinstyle="miter"/>
             <v:formulas>
               <v:f eqn="if lineDrawn pixelLineWidth 0"/>
@@ -3510,17 +3642,17 @@
             <v:path o:extrusionok="f" gradientshapeok="t" o:connecttype="rect"/>
             <o:lock v:ext="edit" aspectratio="t"/>
           </v:shapetype>
-          <v:shape id="Picture 1764707949" o:spid="_x0000_i1025" type="#_x0000_t75" style="width:14pt;height:14pt;visibility:visible;mso-wrap-style:square">
+          <v:shape id="Picture 753720425" o:spid="_x0000_i1025" type="#_x0000_t75" style="width:14pt;height:14pt;visibility:visible;mso-wrap-style:square">
             <v:imagedata r:id="rId1" o:title=""/>
           </v:shape>
         </w:pict>
       </mc:Choice>
       <mc:Fallback>
         <w:drawing>
-          <wp:inline distT="0" distB="0" distL="0" distR="0" wp14:anchorId="1CAD06E8" wp14:editId="34EEC12F">
+          <wp:inline distT="0" distB="0" distL="0" distR="0" wp14:anchorId="7D4EA6CD" wp14:editId="4D620A6C">
             <wp:extent cx="177800" cy="177800"/>
             <wp:effectExtent l="0" t="0" r="0" b="0"/>
-            <wp:docPr id="1764707949" name="Picture 1764707949"/>
+            <wp:docPr id="753720425" name="Picture 753720425"/>
             <wp:cNvGraphicFramePr>
               <a:graphicFrameLocks xmlns:a="http://schemas.openxmlformats.org/drawingml/2006/main" noChangeAspect="1"/>
             </wp:cNvGraphicFramePr>
@@ -4980,6 +5112,119 @@
     </w:lvl>
   </w:abstractNum>
   <w:abstractNum w:abstractNumId="9" w15:restartNumberingAfterBreak="0">
+    <w:nsid w:val="29F83B83"/>
+    <w:multiLevelType w:val="multilevel"/>
+    <w:tmpl w:val="9A00A1D4"/>
+    <w:lvl w:ilvl="0">
+      <w:start w:val="1"/>
+      <w:numFmt w:val="decimal"/>
+      <w:lvlText w:val="%1."/>
+      <w:lvlJc w:val="left"/>
+      <w:pPr>
+        <w:tabs>
+          <w:tab w:val="num" w:pos="720"/>
+        </w:tabs>
+        <w:ind w:left="720" w:hanging="360"/>
+      </w:pPr>
+    </w:lvl>
+    <w:lvl w:ilvl="1" w:tentative="1">
+      <w:start w:val="1"/>
+      <w:numFmt w:val="decimal"/>
+      <w:lvlText w:val="%2."/>
+      <w:lvlJc w:val="left"/>
+      <w:pPr>
+        <w:tabs>
+          <w:tab w:val="num" w:pos="1440"/>
+        </w:tabs>
+        <w:ind w:left="1440" w:hanging="360"/>
+      </w:pPr>
+    </w:lvl>
+    <w:lvl w:ilvl="2" w:tentative="1">
+      <w:start w:val="1"/>
+      <w:numFmt w:val="decimal"/>
+      <w:lvlText w:val="%3."/>
+      <w:lvlJc w:val="left"/>
+      <w:pPr>
+        <w:tabs>
+          <w:tab w:val="num" w:pos="2160"/>
+        </w:tabs>
+        <w:ind w:left="2160" w:hanging="360"/>
+      </w:pPr>
+    </w:lvl>
+    <w:lvl w:ilvl="3" w:tentative="1">
+      <w:start w:val="1"/>
+      <w:numFmt w:val="decimal"/>
+      <w:lvlText w:val="%4."/>
+      <w:lvlJc w:val="left"/>
+      <w:pPr>
+        <w:tabs>
+          <w:tab w:val="num" w:pos="2880"/>
+        </w:tabs>
+        <w:ind w:left="2880" w:hanging="360"/>
+      </w:pPr>
+    </w:lvl>
+    <w:lvl w:ilvl="4" w:tentative="1">
+      <w:start w:val="1"/>
+      <w:numFmt w:val="decimal"/>
+      <w:lvlText w:val="%5."/>
+      <w:lvlJc w:val="left"/>
+      <w:pPr>
+        <w:tabs>
+          <w:tab w:val="num" w:pos="3600"/>
+        </w:tabs>
+        <w:ind w:left="3600" w:hanging="360"/>
+      </w:pPr>
+    </w:lvl>
+    <w:lvl w:ilvl="5" w:tentative="1">
+      <w:start w:val="1"/>
+      <w:numFmt w:val="decimal"/>
+      <w:lvlText w:val="%6."/>
+      <w:lvlJc w:val="left"/>
+      <w:pPr>
+        <w:tabs>
+          <w:tab w:val="num" w:pos="4320"/>
+        </w:tabs>
+        <w:ind w:left="4320" w:hanging="360"/>
+      </w:pPr>
+    </w:lvl>
+    <w:lvl w:ilvl="6" w:tentative="1">
+      <w:start w:val="1"/>
+      <w:numFmt w:val="decimal"/>
+      <w:lvlText w:val="%7."/>
+      <w:lvlJc w:val="left"/>
+      <w:pPr>
+        <w:tabs>
+          <w:tab w:val="num" w:pos="5040"/>
+        </w:tabs>
+        <w:ind w:left="5040" w:hanging="360"/>
+      </w:pPr>
+    </w:lvl>
+    <w:lvl w:ilvl="7" w:tentative="1">
+      <w:start w:val="1"/>
+      <w:numFmt w:val="decimal"/>
+      <w:lvlText w:val="%8."/>
+      <w:lvlJc w:val="left"/>
+      <w:pPr>
+        <w:tabs>
+          <w:tab w:val="num" w:pos="5760"/>
+        </w:tabs>
+        <w:ind w:left="5760" w:hanging="360"/>
+      </w:pPr>
+    </w:lvl>
+    <w:lvl w:ilvl="8" w:tentative="1">
+      <w:start w:val="1"/>
+      <w:numFmt w:val="decimal"/>
+      <w:lvlText w:val="%9."/>
+      <w:lvlJc w:val="left"/>
+      <w:pPr>
+        <w:tabs>
+          <w:tab w:val="num" w:pos="6480"/>
+        </w:tabs>
+        <w:ind w:left="6480" w:hanging="360"/>
+      </w:pPr>
+    </w:lvl>
+  </w:abstractNum>
+  <w:abstractNum w:abstractNumId="10" w15:restartNumberingAfterBreak="0">
     <w:nsid w:val="36675932"/>
     <w:multiLevelType w:val="hybridMultilevel"/>
     <w:tmpl w:val="7C983054"/>
@@ -5092,7 +5337,7 @@
       </w:rPr>
     </w:lvl>
   </w:abstractNum>
-  <w:abstractNum w:abstractNumId="10" w15:restartNumberingAfterBreak="0">
+  <w:abstractNum w:abstractNumId="11" w15:restartNumberingAfterBreak="0">
     <w:nsid w:val="367A2A95"/>
     <w:multiLevelType w:val="multilevel"/>
     <w:tmpl w:val="9EFA5118"/>
@@ -5187,7 +5432,7 @@
       </w:pPr>
     </w:lvl>
   </w:abstractNum>
-  <w:abstractNum w:abstractNumId="11" w15:restartNumberingAfterBreak="0">
+  <w:abstractNum w:abstractNumId="12" w15:restartNumberingAfterBreak="0">
     <w:nsid w:val="36DB2039"/>
     <w:multiLevelType w:val="hybridMultilevel"/>
     <w:tmpl w:val="516022C6"/>
@@ -5300,7 +5545,7 @@
       </w:rPr>
     </w:lvl>
   </w:abstractNum>
-  <w:abstractNum w:abstractNumId="12" w15:restartNumberingAfterBreak="0">
+  <w:abstractNum w:abstractNumId="13" w15:restartNumberingAfterBreak="0">
     <w:nsid w:val="3AD23E27"/>
     <w:multiLevelType w:val="hybridMultilevel"/>
     <w:tmpl w:val="1AFA3386"/>
@@ -5424,7 +5669,7 @@
       </w:rPr>
     </w:lvl>
   </w:abstractNum>
-  <w:abstractNum w:abstractNumId="13" w15:restartNumberingAfterBreak="0">
+  <w:abstractNum w:abstractNumId="14" w15:restartNumberingAfterBreak="0">
     <w:nsid w:val="448C650B"/>
     <w:multiLevelType w:val="hybridMultilevel"/>
     <w:tmpl w:val="2C5E92EE"/>
@@ -5636,7 +5881,7 @@
       </w:rPr>
     </w:lvl>
   </w:abstractNum>
-  <w:abstractNum w:abstractNumId="14" w15:restartNumberingAfterBreak="0">
+  <w:abstractNum w:abstractNumId="15" w15:restartNumberingAfterBreak="0">
     <w:nsid w:val="46E459BD"/>
     <w:multiLevelType w:val="hybridMultilevel"/>
     <w:tmpl w:val="8182F946"/>
@@ -5748,7 +5993,7 @@
       </w:rPr>
     </w:lvl>
   </w:abstractNum>
-  <w:abstractNum w:abstractNumId="15" w15:restartNumberingAfterBreak="0">
+  <w:abstractNum w:abstractNumId="16" w15:restartNumberingAfterBreak="0">
     <w:nsid w:val="4C8438E7"/>
     <w:multiLevelType w:val="hybridMultilevel"/>
     <w:tmpl w:val="45785E62"/>
@@ -5861,7 +6106,7 @@
       </w:rPr>
     </w:lvl>
   </w:abstractNum>
-  <w:abstractNum w:abstractNumId="16" w15:restartNumberingAfterBreak="0">
+  <w:abstractNum w:abstractNumId="17" w15:restartNumberingAfterBreak="0">
     <w:nsid w:val="572979E3"/>
     <w:multiLevelType w:val="multilevel"/>
     <w:tmpl w:val="B4A0CCE4"/>
@@ -6076,7 +6321,7 @@
       </w:rPr>
     </w:lvl>
   </w:abstractNum>
-  <w:abstractNum w:abstractNumId="17" w15:restartNumberingAfterBreak="0">
+  <w:abstractNum w:abstractNumId="18" w15:restartNumberingAfterBreak="0">
     <w:nsid w:val="5A17664F"/>
     <w:multiLevelType w:val="hybridMultilevel"/>
     <w:tmpl w:val="6DD862C0"/>
@@ -6288,7 +6533,7 @@
       </w:rPr>
     </w:lvl>
   </w:abstractNum>
-  <w:abstractNum w:abstractNumId="18" w15:restartNumberingAfterBreak="0">
+  <w:abstractNum w:abstractNumId="19" w15:restartNumberingAfterBreak="0">
     <w:nsid w:val="5CF73D04"/>
     <w:multiLevelType w:val="hybridMultilevel"/>
     <w:tmpl w:val="EC844602"/>
@@ -6500,7 +6745,7 @@
       </w:rPr>
     </w:lvl>
   </w:abstractNum>
-  <w:abstractNum w:abstractNumId="19" w15:restartNumberingAfterBreak="0">
+  <w:abstractNum w:abstractNumId="20" w15:restartNumberingAfterBreak="0">
     <w:nsid w:val="5DD17322"/>
     <w:multiLevelType w:val="multilevel"/>
     <w:tmpl w:val="0409001F"/>
@@ -6586,7 +6831,7 @@
       </w:pPr>
     </w:lvl>
   </w:abstractNum>
-  <w:abstractNum w:abstractNumId="20" w15:restartNumberingAfterBreak="0">
+  <w:abstractNum w:abstractNumId="21" w15:restartNumberingAfterBreak="0">
     <w:nsid w:val="67475A48"/>
     <w:multiLevelType w:val="hybridMultilevel"/>
     <w:tmpl w:val="A872A234"/>
@@ -6726,7 +6971,7 @@
       </w:rPr>
     </w:lvl>
   </w:abstractNum>
-  <w:abstractNum w:abstractNumId="21" w15:restartNumberingAfterBreak="0">
+  <w:abstractNum w:abstractNumId="22" w15:restartNumberingAfterBreak="0">
     <w:nsid w:val="6AA1790A"/>
     <w:multiLevelType w:val="hybridMultilevel"/>
     <w:tmpl w:val="74846918"/>
@@ -6815,7 +7060,7 @@
       </w:pPr>
     </w:lvl>
   </w:abstractNum>
-  <w:abstractNum w:abstractNumId="22" w15:restartNumberingAfterBreak="0">
+  <w:abstractNum w:abstractNumId="23" w15:restartNumberingAfterBreak="0">
     <w:nsid w:val="6AA2233C"/>
     <w:multiLevelType w:val="hybridMultilevel"/>
     <w:tmpl w:val="E5FA5B22"/>
@@ -7027,7 +7272,7 @@
       </w:rPr>
     </w:lvl>
   </w:abstractNum>
-  <w:abstractNum w:abstractNumId="23" w15:restartNumberingAfterBreak="0">
+  <w:abstractNum w:abstractNumId="24" w15:restartNumberingAfterBreak="0">
     <w:nsid w:val="717C6568"/>
     <w:multiLevelType w:val="hybridMultilevel"/>
     <w:tmpl w:val="74846918"/>
@@ -7116,7 +7361,7 @@
       </w:pPr>
     </w:lvl>
   </w:abstractNum>
-  <w:abstractNum w:abstractNumId="24" w15:restartNumberingAfterBreak="0">
+  <w:abstractNum w:abstractNumId="25" w15:restartNumberingAfterBreak="0">
     <w:nsid w:val="77CA44D1"/>
     <w:multiLevelType w:val="hybridMultilevel"/>
     <w:tmpl w:val="926CBC52"/>
@@ -7206,7 +7451,7 @@
       </w:pPr>
     </w:lvl>
   </w:abstractNum>
-  <w:abstractNum w:abstractNumId="25" w15:restartNumberingAfterBreak="0">
+  <w:abstractNum w:abstractNumId="26" w15:restartNumberingAfterBreak="0">
     <w:nsid w:val="7A65414F"/>
     <w:multiLevelType w:val="hybridMultilevel"/>
     <w:tmpl w:val="59B86904"/>
@@ -7318,7 +7563,7 @@
       </w:rPr>
     </w:lvl>
   </w:abstractNum>
-  <w:abstractNum w:abstractNumId="26" w15:restartNumberingAfterBreak="0">
+  <w:abstractNum w:abstractNumId="27" w15:restartNumberingAfterBreak="0">
     <w:nsid w:val="7E5021C5"/>
     <w:multiLevelType w:val="hybridMultilevel"/>
     <w:tmpl w:val="EF46CF86"/>
@@ -7432,19 +7677,19 @@
     </w:lvl>
   </w:abstractNum>
   <w:num w:numId="1" w16cid:durableId="1495298603">
-    <w:abstractNumId w:val="13"/>
+    <w:abstractNumId w:val="14"/>
   </w:num>
   <w:num w:numId="2" w16cid:durableId="1645888667">
     <w:abstractNumId w:val="7"/>
   </w:num>
   <w:num w:numId="3" w16cid:durableId="1040323088">
-    <w:abstractNumId w:val="18"/>
+    <w:abstractNumId w:val="19"/>
   </w:num>
   <w:num w:numId="4" w16cid:durableId="585916832">
     <w:abstractNumId w:val="6"/>
   </w:num>
   <w:num w:numId="5" w16cid:durableId="1530408910">
-    <w:abstractNumId w:val="17"/>
+    <w:abstractNumId w:val="18"/>
   </w:num>
   <w:num w:numId="6" w16cid:durableId="84961123">
     <w:abstractNumId w:val="1"/>
@@ -7453,34 +7698,34 @@
     <w:abstractNumId w:val="8"/>
   </w:num>
   <w:num w:numId="8" w16cid:durableId="1351027366">
-    <w:abstractNumId w:val="16"/>
+    <w:abstractNumId w:val="17"/>
   </w:num>
   <w:num w:numId="9" w16cid:durableId="2036999612">
-    <w:abstractNumId w:val="24"/>
+    <w:abstractNumId w:val="25"/>
   </w:num>
   <w:num w:numId="10" w16cid:durableId="567039875">
-    <w:abstractNumId w:val="26"/>
+    <w:abstractNumId w:val="27"/>
   </w:num>
   <w:num w:numId="11" w16cid:durableId="1643266821">
-    <w:abstractNumId w:val="9"/>
+    <w:abstractNumId w:val="10"/>
   </w:num>
   <w:num w:numId="12" w16cid:durableId="1473328805">
     <w:abstractNumId w:val="2"/>
   </w:num>
   <w:num w:numId="13" w16cid:durableId="1367365715">
-    <w:abstractNumId w:val="11"/>
+    <w:abstractNumId w:val="12"/>
   </w:num>
   <w:num w:numId="14" w16cid:durableId="1367608449">
     <w:abstractNumId w:val="4"/>
   </w:num>
   <w:num w:numId="15" w16cid:durableId="2070306397">
-    <w:abstractNumId w:val="20"/>
+    <w:abstractNumId w:val="21"/>
   </w:num>
   <w:num w:numId="16" w16cid:durableId="1727215565">
     <w:abstractNumId w:val="0"/>
   </w:num>
   <w:num w:numId="17" w16cid:durableId="1759718336">
-    <w:abstractNumId w:val="10"/>
+    <w:abstractNumId w:val="11"/>
     <w:lvlOverride w:ilvl="0">
       <w:startOverride w:val="1"/>
     </w:lvlOverride>
@@ -7516,43 +7761,46 @@
     <w:abstractNumId w:val="5"/>
   </w:num>
   <w:num w:numId="20" w16cid:durableId="1203060829">
-    <w:abstractNumId w:val="21"/>
+    <w:abstractNumId w:val="22"/>
   </w:num>
   <w:num w:numId="21" w16cid:durableId="1897470007">
+    <w:abstractNumId w:val="24"/>
+  </w:num>
+  <w:num w:numId="22" w16cid:durableId="2135326373">
+    <w:abstractNumId w:val="15"/>
+  </w:num>
+  <w:num w:numId="23" w16cid:durableId="32510864">
+    <w:abstractNumId w:val="26"/>
+  </w:num>
+  <w:num w:numId="24" w16cid:durableId="1053695616">
+    <w:abstractNumId w:val="16"/>
+  </w:num>
+  <w:num w:numId="25" w16cid:durableId="938878451">
     <w:abstractNumId w:val="23"/>
   </w:num>
-  <w:num w:numId="22" w16cid:durableId="2135326373">
-    <w:abstractNumId w:val="14"/>
-  </w:num>
-  <w:num w:numId="23" w16cid:durableId="32510864">
-    <w:abstractNumId w:val="25"/>
-  </w:num>
-  <w:num w:numId="24" w16cid:durableId="1053695616">
-    <w:abstractNumId w:val="15"/>
-  </w:num>
-  <w:num w:numId="25" w16cid:durableId="938878451">
-    <w:abstractNumId w:val="22"/>
-  </w:num>
   <w:num w:numId="26" w16cid:durableId="1108618063">
-    <w:abstractNumId w:val="19"/>
+    <w:abstractNumId w:val="20"/>
   </w:num>
   <w:num w:numId="27" w16cid:durableId="102577940">
-    <w:abstractNumId w:val="16"/>
+    <w:abstractNumId w:val="17"/>
   </w:num>
   <w:num w:numId="28" w16cid:durableId="87774591">
-    <w:abstractNumId w:val="16"/>
+    <w:abstractNumId w:val="17"/>
   </w:num>
   <w:num w:numId="29" w16cid:durableId="673803452">
-    <w:abstractNumId w:val="16"/>
+    <w:abstractNumId w:val="17"/>
   </w:num>
   <w:num w:numId="30" w16cid:durableId="762065608">
-    <w:abstractNumId w:val="16"/>
+    <w:abstractNumId w:val="17"/>
   </w:num>
   <w:num w:numId="31" w16cid:durableId="531069739">
-    <w:abstractNumId w:val="12"/>
+    <w:abstractNumId w:val="13"/>
   </w:num>
   <w:num w:numId="32" w16cid:durableId="224537223">
-    <w:abstractNumId w:val="16"/>
+    <w:abstractNumId w:val="17"/>
+  </w:num>
+  <w:num w:numId="33" w16cid:durableId="1489907389">
+    <w:abstractNumId w:val="9"/>
   </w:num>
 </w:numbering>
 </file>
@@ -8051,7 +8299,6 @@
   <w:style w:type="character" w:default="1" w:styleId="DefaultParagraphFont">
     <w:name w:val="Default Paragraph Font"/>
     <w:uiPriority w:val="1"/>
-    <w:semiHidden/>
     <w:unhideWhenUsed/>
   </w:style>
   <w:style w:type="table" w:default="1" w:styleId="TableNormal">
@@ -9245,15 +9492,6 @@
 </file>
 
 <file path=customXml/item1.xml><?xml version="1.0" encoding="utf-8"?>
-<?mso-contentType ?>
-<FormTemplates xmlns="http://schemas.microsoft.com/sharepoint/v3/contenttype/forms">
-  <Display>DocumentLibraryForm</Display>
-  <Edit>DocumentLibraryForm</Edit>
-  <New>DocumentLibraryForm</New>
-</FormTemplates>
-</file>
-
-<file path=customXml/item2.xml><?xml version="1.0" encoding="utf-8"?>
 <ct:contentTypeSchema xmlns:ct="http://schemas.microsoft.com/office/2006/metadata/contentType" xmlns:ma="http://schemas.microsoft.com/office/2006/metadata/properties/metaAttributes" ct:_="" ma:_="" ma:contentTypeName="Document" ma:contentTypeID="0x01010085BEF43317B4F840AC0C37E0D977D82E" ma:contentTypeVersion="12" ma:contentTypeDescription="Create a new document." ma:contentTypeScope="" ma:versionID="a2338617cbfbb51b2c0d33e4cb8684b1">
   <xsd:schema xmlns:xsd="http://www.w3.org/2001/XMLSchema" xmlns:xs="http://www.w3.org/2001/XMLSchema" xmlns:p="http://schemas.microsoft.com/office/2006/metadata/properties" xmlns:ns2="ff4433bc-22a3-4dac-805f-c635aff40461" xmlns:ns3="692651b8-6577-4651-a352-3b631599c082" targetNamespace="http://schemas.microsoft.com/office/2006/metadata/properties" ma:root="true" ma:fieldsID="0f93a4889667a75834aa97db9b978e47" ns2:_="" ns3:_="">
     <xsd:import namespace="ff4433bc-22a3-4dac-805f-c635aff40461"/>
@@ -9454,7 +9692,20 @@
 </ct:contentTypeSchema>
 </file>
 
+<file path=customXml/item2.xml><?xml version="1.0" encoding="utf-8"?>
+<?mso-contentType ?>
+<FormTemplates xmlns="http://schemas.microsoft.com/sharepoint/v3/contenttype/forms">
+  <Display>DocumentLibraryForm</Display>
+  <Edit>DocumentLibraryForm</Edit>
+  <New>DocumentLibraryForm</New>
+</FormTemplates>
+</file>
+
 <file path=customXml/item3.xml><?xml version="1.0" encoding="utf-8"?>
+<b:Sources xmlns:b="http://schemas.openxmlformats.org/officeDocument/2006/bibliography" xmlns="http://schemas.openxmlformats.org/officeDocument/2006/bibliography" SelectedStyle="\APASixthEditionOfficeOnline.xsl" StyleName="APA" Version="6"/>
+</file>
+
+<file path=customXml/item4.xml><?xml version="1.0" encoding="utf-8"?>
 <p:properties xmlns:p="http://schemas.microsoft.com/office/2006/metadata/properties" xmlns:xsi="http://www.w3.org/2001/XMLSchema-instance" xmlns:pc="http://schemas.microsoft.com/office/infopath/2007/PartnerControls">
   <documentManagement>
     <TaxCatchAll xmlns="692651b8-6577-4651-a352-3b631599c082" xsi:nil="true"/>
@@ -9465,19 +9716,7 @@
 </p:properties>
 </file>
 
-<file path=customXml/item4.xml><?xml version="1.0" encoding="utf-8"?>
-<b:Sources xmlns:b="http://schemas.openxmlformats.org/officeDocument/2006/bibliography" xmlns="http://schemas.openxmlformats.org/officeDocument/2006/bibliography" SelectedStyle="\APASixthEditionOfficeOnline.xsl" StyleName="APA" Version="6"/>
-</file>
-
 <file path=customXml/itemProps1.xml><?xml version="1.0" encoding="utf-8"?>
-<ds:datastoreItem xmlns:ds="http://schemas.openxmlformats.org/officeDocument/2006/customXml" ds:itemID="{899977B6-4170-4EBB-8EC3-1772808F953C}">
-  <ds:schemaRefs>
-    <ds:schemaRef ds:uri="http://schemas.microsoft.com/sharepoint/v3/contenttype/forms"/>
-  </ds:schemaRefs>
-</ds:datastoreItem>
-</file>
-
-<file path=customXml/itemProps2.xml><?xml version="1.0" encoding="utf-8"?>
 <ds:datastoreItem xmlns:ds="http://schemas.openxmlformats.org/officeDocument/2006/customXml" ds:itemID="{336297D6-A3E4-40E3-8F58-11EE5F3018B5}">
   <ds:schemaRefs>
     <ds:schemaRef ds:uri="http://schemas.microsoft.com/office/2006/metadata/contentType"/>
@@ -9496,7 +9735,23 @@
 </ds:datastoreItem>
 </file>
 
+<file path=customXml/itemProps2.xml><?xml version="1.0" encoding="utf-8"?>
+<ds:datastoreItem xmlns:ds="http://schemas.openxmlformats.org/officeDocument/2006/customXml" ds:itemID="{899977B6-4170-4EBB-8EC3-1772808F953C}">
+  <ds:schemaRefs>
+    <ds:schemaRef ds:uri="http://schemas.microsoft.com/sharepoint/v3/contenttype/forms"/>
+  </ds:schemaRefs>
+</ds:datastoreItem>
+</file>
+
 <file path=customXml/itemProps3.xml><?xml version="1.0" encoding="utf-8"?>
+<ds:datastoreItem xmlns:ds="http://schemas.openxmlformats.org/officeDocument/2006/customXml" ds:itemID="{EC954A2E-28E0-4668-92E6-EA1FC2D35EDB}">
+  <ds:schemaRefs>
+    <ds:schemaRef ds:uri="http://schemas.openxmlformats.org/officeDocument/2006/bibliography"/>
+  </ds:schemaRefs>
+</ds:datastoreItem>
+</file>
+
+<file path=customXml/itemProps4.xml><?xml version="1.0" encoding="utf-8"?>
 <ds:datastoreItem xmlns:ds="http://schemas.openxmlformats.org/officeDocument/2006/customXml" ds:itemID="{E9D8FE69-F782-45F1-BD7D-38E143528BC3}">
   <ds:schemaRefs>
     <ds:schemaRef ds:uri="http://schemas.microsoft.com/office/2006/metadata/properties"/>
@@ -9505,12 +9760,4 @@
     <ds:schemaRef ds:uri="ff4433bc-22a3-4dac-805f-c635aff40461"/>
   </ds:schemaRefs>
 </ds:datastoreItem>
-</file>
-
-<file path=customXml/itemProps4.xml><?xml version="1.0" encoding="utf-8"?>
-<ds:datastoreItem xmlns:ds="http://schemas.openxmlformats.org/officeDocument/2006/customXml" ds:itemID="{EC954A2E-28E0-4668-92E6-EA1FC2D35EDB}">
-  <ds:schemaRefs>
-    <ds:schemaRef ds:uri="http://schemas.openxmlformats.org/officeDocument/2006/bibliography"/>
-  </ds:schemaRefs>
-</ds:datastoreItem>
 </file>
</xml_diff>